<commit_message>
Removed title of document.
</commit_message>
<xml_diff>
--- a/Track2-Exercise1.docx
+++ b/Track2-Exercise1.docx
@@ -12,42 +12,6 @@
           <w:szCs w:val="28"/>
         </w:rPr>
       </w:pPr>
-      <w:r>
-        <w:rPr>
-          <w:rFonts w:ascii="Footlight MT Light" w:hAnsi="Footlight MT Light"/>
-          <w:b/>
-          <w:sz w:val="36"/>
-          <w:szCs w:val="28"/>
-        </w:rPr>
-        <w:t>Track</w:t>
-      </w:r>
-      <w:r>
-        <w:rPr>
-          <w:rFonts w:ascii="Footlight MT Light" w:hAnsi="Footlight MT Light"/>
-          <w:b/>
-          <w:sz w:val="36"/>
-          <w:szCs w:val="28"/>
-        </w:rPr>
-        <w:t xml:space="preserve"> 2</w:t>
-      </w:r>
-      <w:r>
-        <w:rPr>
-          <w:rFonts w:ascii="Footlight MT Light" w:hAnsi="Footlight MT Light"/>
-          <w:b/>
-          <w:sz w:val="36"/>
-          <w:szCs w:val="28"/>
-        </w:rPr>
-        <w:t xml:space="preserve">: </w:t>
-      </w:r>
-      <w:r>
-        <w:rPr>
-          <w:rFonts w:ascii="Footlight MT Light" w:hAnsi="Footlight MT Light"/>
-          <w:b/>
-          <w:sz w:val="36"/>
-          <w:szCs w:val="28"/>
-        </w:rPr>
-        <w:t>Java Basics</w:t>
-      </w:r>
     </w:p>
     <w:tbl>
       <w:tblPr>
@@ -203,25 +167,7 @@
                 <w:b/>
                 <w:color w:val="FF0000"/>
               </w:rPr>
-              <w:t>&lt;</w:t>
-            </w:r>
-            <w:proofErr w:type="spellStart"/>
-            <w:r>
-              <w:rPr>
-                <w:rFonts w:ascii="Gabarito" w:hAnsi="Gabarito"/>
-                <w:b/>
-                <w:color w:val="FF0000"/>
-              </w:rPr>
-              <w:t>FamilyName</w:t>
-            </w:r>
-            <w:proofErr w:type="spellEnd"/>
-            <w:r>
-              <w:rPr>
-                <w:rFonts w:ascii="Gabarito" w:hAnsi="Gabarito"/>
-                <w:b/>
-                <w:color w:val="FF0000"/>
-              </w:rPr>
-              <w:t>&gt;</w:t>
+              <w:t>&lt;FamilyName&gt;</w:t>
             </w:r>
             <w:r>
               <w:rPr>
@@ -330,7 +276,6 @@
         </w:rPr>
         <w:t xml:space="preserve"> Drop all your corrected classes inside </w:t>
       </w:r>
-      <w:proofErr w:type="spellStart"/>
       <w:r>
         <w:rPr>
           <w:rFonts w:ascii="Google Sans Code" w:hAnsi="Google Sans Code" w:cstheme="minorHAnsi"/>
@@ -358,7 +303,6 @@
         </w:rPr>
         <w:t>.a</w:t>
       </w:r>
-      <w:proofErr w:type="spellEnd"/>
       <w:r>
         <w:rPr>
           <w:rFonts w:ascii="Gabarito" w:hAnsi="Gabarito" w:cstheme="minorHAnsi"/>
@@ -445,46 +389,8 @@
           <w:sz w:val="20"/>
           <w:szCs w:val="18"/>
         </w:rPr>
-        <w:t xml:space="preserve">    public static void </w:t>
-      </w:r>
-      <w:proofErr w:type="gramStart"/>
-      <w:r>
-        <w:rPr>
-          <w:rFonts w:ascii="Google Sans Code" w:hAnsi="Google Sans Code" w:cs="Courier New"/>
-          <w:sz w:val="20"/>
-          <w:szCs w:val="18"/>
-        </w:rPr>
-        <w:t>main(String[</w:t>
-      </w:r>
-      <w:proofErr w:type="gramEnd"/>
-      <w:r>
-        <w:rPr>
-          <w:rFonts w:ascii="Google Sans Code" w:hAnsi="Google Sans Code" w:cs="Courier New"/>
-          <w:sz w:val="20"/>
-          <w:szCs w:val="18"/>
-        </w:rPr>
-        <w:t xml:space="preserve">] </w:t>
-      </w:r>
-      <w:proofErr w:type="spellStart"/>
-      <w:proofErr w:type="gramStart"/>
-      <w:r>
-        <w:rPr>
-          <w:rFonts w:ascii="Google Sans Code" w:hAnsi="Google Sans Code" w:cs="Courier New"/>
-          <w:sz w:val="20"/>
-          <w:szCs w:val="18"/>
-        </w:rPr>
-        <w:t>args</w:t>
-      </w:r>
-      <w:proofErr w:type="spellEnd"/>
-      <w:r>
-        <w:rPr>
-          <w:rFonts w:ascii="Google Sans Code" w:hAnsi="Google Sans Code" w:cs="Courier New"/>
-          <w:sz w:val="20"/>
-          <w:szCs w:val="18"/>
-        </w:rPr>
-        <w:t>) {</w:t>
-      </w:r>
-      <w:proofErr w:type="gramEnd"/>
+        <w:t xml:space="preserve">    public static void main(String[] args) {</w:t>
+      </w:r>
     </w:p>
     <w:p>
       <w:pPr>
@@ -533,23 +439,13 @@
         </w:rPr>
         <w:t xml:space="preserve">int smaller = </w:t>
       </w:r>
-      <w:proofErr w:type="gramStart"/>
-      <w:r>
-        <w:rPr>
-          <w:rFonts w:ascii="Google Sans Code" w:hAnsi="Google Sans Code" w:cs="Courier New"/>
-          <w:sz w:val="20"/>
-          <w:szCs w:val="18"/>
-        </w:rPr>
-        <w:t>minimum(</w:t>
-      </w:r>
-      <w:proofErr w:type="gramEnd"/>
-      <w:r>
-        <w:rPr>
-          <w:rFonts w:ascii="Google Sans Code" w:hAnsi="Google Sans Code" w:cs="Courier New"/>
-          <w:sz w:val="20"/>
-          <w:szCs w:val="18"/>
-        </w:rPr>
-        <w:t>a, b);</w:t>
+      <w:r>
+        <w:rPr>
+          <w:rFonts w:ascii="Google Sans Code" w:hAnsi="Google Sans Code" w:cs="Courier New"/>
+          <w:sz w:val="20"/>
+          <w:szCs w:val="18"/>
+        </w:rPr>
+        <w:t>minimum(a, b);</w:t>
       </w:r>
     </w:p>
     <w:p>
@@ -589,25 +485,7 @@
           <w:sz w:val="20"/>
           <w:szCs w:val="18"/>
         </w:rPr>
-        <w:t xml:space="preserve">        </w:t>
-      </w:r>
-      <w:proofErr w:type="spellStart"/>
-      <w:r>
-        <w:rPr>
-          <w:rFonts w:ascii="Google Sans Code" w:hAnsi="Google Sans Code" w:cs="Courier New"/>
-          <w:sz w:val="20"/>
-          <w:szCs w:val="18"/>
-        </w:rPr>
-        <w:t>System.out.println</w:t>
-      </w:r>
-      <w:proofErr w:type="spellEnd"/>
-      <w:r>
-        <w:rPr>
-          <w:rFonts w:ascii="Google Sans Code" w:hAnsi="Google Sans Code" w:cs="Courier New"/>
-          <w:sz w:val="20"/>
-          <w:szCs w:val="18"/>
-        </w:rPr>
-        <w:t>("a is the smallest!");</w:t>
+        <w:t xml:space="preserve">        System.out.println("a is the smallest!");</w:t>
       </w:r>
     </w:p>
     <w:p>
@@ -627,33 +505,15 @@
           <w:sz w:val="20"/>
           <w:szCs w:val="18"/>
         </w:rPr>
-        <w:t xml:space="preserve">        </w:t>
-      </w:r>
-      <w:proofErr w:type="gramStart"/>
-      <w:r>
-        <w:rPr>
-          <w:rFonts w:ascii="Google Sans Code" w:hAnsi="Google Sans Code" w:cs="Courier New"/>
-          <w:sz w:val="20"/>
-          <w:szCs w:val="18"/>
-        </w:rPr>
-        <w:t>}</w:t>
-      </w:r>
-      <w:r>
-        <w:rPr>
-          <w:rFonts w:ascii="Google Sans Code" w:hAnsi="Google Sans Code" w:cs="Courier New"/>
-          <w:sz w:val="20"/>
-          <w:szCs w:val="18"/>
-        </w:rPr>
-        <w:t>else</w:t>
-      </w:r>
-      <w:proofErr w:type="gramEnd"/>
-      <w:r>
-        <w:rPr>
-          <w:rFonts w:ascii="Google Sans Code" w:hAnsi="Google Sans Code" w:cs="Courier New"/>
-          <w:sz w:val="20"/>
-          <w:szCs w:val="18"/>
-        </w:rPr>
-        <w:t>{</w:t>
+        <w:t xml:space="preserve">        }</w:t>
+      </w:r>
+      <w:r>
+        <w:rPr>
+          <w:rFonts w:ascii="Google Sans Code" w:hAnsi="Google Sans Code" w:cs="Courier New"/>
+          <w:sz w:val="20"/>
+          <w:szCs w:val="18"/>
+        </w:rPr>
+        <w:t>else{</w:t>
       </w:r>
     </w:p>
     <w:p>
@@ -725,43 +585,7 @@
           <w:sz w:val="20"/>
           <w:szCs w:val="18"/>
         </w:rPr>
-        <w:t xml:space="preserve">    public static void </w:t>
-      </w:r>
-      <w:proofErr w:type="gramStart"/>
-      <w:r>
-        <w:rPr>
-          <w:rFonts w:ascii="Google Sans Code" w:hAnsi="Google Sans Code" w:cs="Courier New"/>
-          <w:sz w:val="20"/>
-          <w:szCs w:val="18"/>
-        </w:rPr>
-        <w:t>minimum(</w:t>
-      </w:r>
-      <w:proofErr w:type="gramEnd"/>
-      <w:r>
-        <w:rPr>
-          <w:rFonts w:ascii="Google Sans Code" w:hAnsi="Google Sans Code" w:cs="Courier New"/>
-          <w:sz w:val="20"/>
-          <w:szCs w:val="18"/>
-        </w:rPr>
-        <w:t xml:space="preserve">int a, int </w:t>
-      </w:r>
-      <w:proofErr w:type="gramStart"/>
-      <w:r>
-        <w:rPr>
-          <w:rFonts w:ascii="Google Sans Code" w:hAnsi="Google Sans Code" w:cs="Courier New"/>
-          <w:sz w:val="20"/>
-          <w:szCs w:val="18"/>
-        </w:rPr>
-        <w:t>b) {</w:t>
-      </w:r>
-      <w:proofErr w:type="gramEnd"/>
-      <w:r>
-        <w:rPr>
-          <w:rFonts w:ascii="Google Sans Code" w:hAnsi="Google Sans Code" w:cs="Courier New"/>
-          <w:sz w:val="20"/>
-          <w:szCs w:val="18"/>
-        </w:rPr>
-        <w:t xml:space="preserve">  </w:t>
+        <w:t xml:space="preserve">    public static void minimum(int a, int b) {  </w:t>
       </w:r>
     </w:p>
     <w:p>
@@ -1025,25 +849,7 @@
           <w:sz w:val="20"/>
           <w:szCs w:val="18"/>
         </w:rPr>
-        <w:t xml:space="preserve">public class </w:t>
-      </w:r>
-      <w:proofErr w:type="spellStart"/>
-      <w:r>
-        <w:rPr>
-          <w:rFonts w:ascii="Google Sans Code" w:hAnsi="Google Sans Code" w:cs="Courier New"/>
-          <w:sz w:val="20"/>
-          <w:szCs w:val="18"/>
-        </w:rPr>
-        <w:t>LotsOf</w:t>
-      </w:r>
-      <w:proofErr w:type="spellEnd"/>
-      <w:r>
-        <w:rPr>
-          <w:rFonts w:ascii="Google Sans Code" w:hAnsi="Google Sans Code" w:cs="Courier New"/>
-          <w:sz w:val="20"/>
-          <w:szCs w:val="18"/>
-        </w:rPr>
-        <w:t xml:space="preserve"> Errors {</w:t>
+        <w:t>public class LotsOf Errors {</w:t>
       </w:r>
     </w:p>
     <w:p>
@@ -1063,43 +869,7 @@
           <w:sz w:val="20"/>
           <w:szCs w:val="18"/>
         </w:rPr>
-        <w:t xml:space="preserve">public static </w:t>
-      </w:r>
-      <w:proofErr w:type="gramStart"/>
-      <w:r>
-        <w:rPr>
-          <w:rFonts w:ascii="Google Sans Code" w:hAnsi="Google Sans Code" w:cs="Courier New"/>
-          <w:sz w:val="20"/>
-          <w:szCs w:val="18"/>
-        </w:rPr>
-        <w:t>main(</w:t>
-      </w:r>
-      <w:proofErr w:type="gramEnd"/>
-      <w:r>
-        <w:rPr>
-          <w:rFonts w:ascii="Google Sans Code" w:hAnsi="Google Sans Code" w:cs="Courier New"/>
-          <w:sz w:val="20"/>
-          <w:szCs w:val="18"/>
-        </w:rPr>
-        <w:t xml:space="preserve">String </w:t>
-      </w:r>
-      <w:proofErr w:type="spellStart"/>
-      <w:r>
-        <w:rPr>
-          <w:rFonts w:ascii="Google Sans Code" w:hAnsi="Google Sans Code" w:cs="Courier New"/>
-          <w:sz w:val="20"/>
-          <w:szCs w:val="18"/>
-        </w:rPr>
-        <w:t>args</w:t>
-      </w:r>
-      <w:proofErr w:type="spellEnd"/>
-      <w:r>
-        <w:rPr>
-          <w:rFonts w:ascii="Google Sans Code" w:hAnsi="Google Sans Code" w:cs="Courier New"/>
-          <w:sz w:val="20"/>
-          <w:szCs w:val="18"/>
-        </w:rPr>
-        <w:t>) {</w:t>
+        <w:t>public static main(String args) {</w:t>
       </w:r>
     </w:p>
     <w:p>
@@ -1113,23 +883,13 @@
           <w:szCs w:val="18"/>
         </w:rPr>
       </w:pPr>
-      <w:proofErr w:type="spellStart"/>
-      <w:r>
-        <w:rPr>
-          <w:rFonts w:ascii="Google Sans Code" w:hAnsi="Google Sans Code" w:cs="Courier New"/>
-          <w:sz w:val="20"/>
-          <w:szCs w:val="18"/>
-        </w:rPr>
-        <w:t>System.println</w:t>
-      </w:r>
-      <w:proofErr w:type="spellEnd"/>
-      <w:r>
-        <w:rPr>
-          <w:rFonts w:ascii="Google Sans Code" w:hAnsi="Google Sans Code" w:cs="Courier New"/>
-          <w:sz w:val="20"/>
-          <w:szCs w:val="18"/>
-        </w:rPr>
-        <w:t>("Hello, world!);</w:t>
+      <w:r>
+        <w:rPr>
+          <w:rFonts w:ascii="Google Sans Code" w:hAnsi="Google Sans Code" w:cs="Courier New"/>
+          <w:sz w:val="20"/>
+          <w:szCs w:val="18"/>
+        </w:rPr>
+        <w:t>System.println("Hello, world!);</w:t>
       </w:r>
     </w:p>
     <w:p>
@@ -1143,23 +903,13 @@
           <w:szCs w:val="18"/>
         </w:rPr>
       </w:pPr>
-      <w:proofErr w:type="gramStart"/>
-      <w:r>
-        <w:rPr>
-          <w:rFonts w:ascii="Google Sans Code" w:hAnsi="Google Sans Code" w:cs="Courier New"/>
-          <w:sz w:val="20"/>
-          <w:szCs w:val="18"/>
-        </w:rPr>
-        <w:t>message(</w:t>
-      </w:r>
-      <w:proofErr w:type="gramEnd"/>
-      <w:r>
-        <w:rPr>
-          <w:rFonts w:ascii="Google Sans Code" w:hAnsi="Google Sans Code" w:cs="Courier New"/>
-          <w:sz w:val="20"/>
-          <w:szCs w:val="18"/>
-        </w:rPr>
-        <w:t>)</w:t>
+      <w:r>
+        <w:rPr>
+          <w:rFonts w:ascii="Google Sans Code" w:hAnsi="Google Sans Code" w:cs="Courier New"/>
+          <w:sz w:val="20"/>
+          <w:szCs w:val="18"/>
+        </w:rPr>
+        <w:t>message()</w:t>
       </w:r>
     </w:p>
     <w:p>
@@ -1256,74 +1006,28 @@
           <w:szCs w:val="18"/>
         </w:rPr>
         <w:tab/>
+        <w:t xml:space="preserve"> System.out println("This program surely cannot";</w:t>
+      </w:r>
+    </w:p>
+    <w:p>
+      <w:pPr>
+        <w:spacing w:after="0"/>
+        <w:ind w:left="720"/>
+        <w:jc w:val="both"/>
+        <w:rPr>
+          <w:rFonts w:ascii="Google Sans Code" w:hAnsi="Google Sans Code" w:cs="Courier New"/>
+          <w:sz w:val="20"/>
+          <w:szCs w:val="18"/>
+        </w:rPr>
+      </w:pPr>
+      <w:r>
+        <w:rPr>
+          <w:rFonts w:ascii="Google Sans Code" w:hAnsi="Google Sans Code" w:cs="Courier New"/>
+          <w:sz w:val="20"/>
+          <w:szCs w:val="18"/>
+        </w:rPr>
         <w:t xml:space="preserve"> </w:t>
       </w:r>
-      <w:proofErr w:type="spellStart"/>
-      <w:r>
-        <w:rPr>
-          <w:rFonts w:ascii="Google Sans Code" w:hAnsi="Google Sans Code" w:cs="Courier New"/>
-          <w:sz w:val="20"/>
-          <w:szCs w:val="18"/>
-        </w:rPr>
-        <w:t>System.out</w:t>
-      </w:r>
-      <w:proofErr w:type="spellEnd"/>
-      <w:r>
-        <w:rPr>
-          <w:rFonts w:ascii="Google Sans Code" w:hAnsi="Google Sans Code" w:cs="Courier New"/>
-          <w:sz w:val="20"/>
-          <w:szCs w:val="18"/>
-        </w:rPr>
-        <w:t xml:space="preserve"> </w:t>
-      </w:r>
-      <w:proofErr w:type="spellStart"/>
-      <w:proofErr w:type="gramStart"/>
-      <w:r>
-        <w:rPr>
-          <w:rFonts w:ascii="Google Sans Code" w:hAnsi="Google Sans Code" w:cs="Courier New"/>
-          <w:sz w:val="20"/>
-          <w:szCs w:val="18"/>
-        </w:rPr>
-        <w:t>println</w:t>
-      </w:r>
-      <w:proofErr w:type="spellEnd"/>
-      <w:r>
-        <w:rPr>
-          <w:rFonts w:ascii="Google Sans Code" w:hAnsi="Google Sans Code" w:cs="Courier New"/>
-          <w:sz w:val="20"/>
-          <w:szCs w:val="18"/>
-        </w:rPr>
-        <w:t>(</w:t>
-      </w:r>
-      <w:proofErr w:type="gramEnd"/>
-      <w:r>
-        <w:rPr>
-          <w:rFonts w:ascii="Google Sans Code" w:hAnsi="Google Sans Code" w:cs="Courier New"/>
-          <w:sz w:val="20"/>
-          <w:szCs w:val="18"/>
-        </w:rPr>
-        <w:t>"This program surely cannot";</w:t>
-      </w:r>
-    </w:p>
-    <w:p>
-      <w:pPr>
-        <w:spacing w:after="0"/>
-        <w:ind w:left="720"/>
-        <w:jc w:val="both"/>
-        <w:rPr>
-          <w:rFonts w:ascii="Google Sans Code" w:hAnsi="Google Sans Code" w:cs="Courier New"/>
-          <w:sz w:val="20"/>
-          <w:szCs w:val="18"/>
-        </w:rPr>
-      </w:pPr>
-      <w:r>
-        <w:rPr>
-          <w:rFonts w:ascii="Google Sans Code" w:hAnsi="Google Sans Code" w:cs="Courier New"/>
-          <w:sz w:val="20"/>
-          <w:szCs w:val="18"/>
-        </w:rPr>
-        <w:t xml:space="preserve"> </w:t>
-      </w:r>
       <w:r>
         <w:rPr>
           <w:rFonts w:ascii="Google Sans Code" w:hAnsi="Google Sans Code" w:cs="Courier New"/>
@@ -1331,25 +1035,7 @@
           <w:szCs w:val="18"/>
         </w:rPr>
         <w:tab/>
-        <w:t xml:space="preserve"> </w:t>
-      </w:r>
-      <w:proofErr w:type="spellStart"/>
-      <w:r>
-        <w:rPr>
-          <w:rFonts w:ascii="Google Sans Code" w:hAnsi="Google Sans Code" w:cs="Courier New"/>
-          <w:sz w:val="20"/>
-          <w:szCs w:val="18"/>
-        </w:rPr>
-        <w:t>System.out.println</w:t>
-      </w:r>
-      <w:proofErr w:type="spellEnd"/>
-      <w:r>
-        <w:rPr>
-          <w:rFonts w:ascii="Google Sans Code" w:hAnsi="Google Sans Code" w:cs="Courier New"/>
-          <w:sz w:val="20"/>
-          <w:szCs w:val="18"/>
-        </w:rPr>
-        <w:t>("have any so-called "errors" in it");</w:t>
+        <w:t xml:space="preserve"> System.out.println("have any so-called "errors" in it");</w:t>
       </w:r>
     </w:p>
     <w:p>
@@ -1474,46 +1160,8 @@
           <w:szCs w:val="18"/>
         </w:rPr>
         <w:tab/>
-        <w:t xml:space="preserve">public static void </w:t>
-      </w:r>
-      <w:proofErr w:type="gramStart"/>
-      <w:r>
-        <w:rPr>
-          <w:rFonts w:ascii="Google Sans Code" w:hAnsi="Google Sans Code" w:cs="Courier New"/>
-          <w:sz w:val="20"/>
-          <w:szCs w:val="18"/>
-        </w:rPr>
-        <w:t>main(String[</w:t>
-      </w:r>
-      <w:proofErr w:type="gramEnd"/>
-      <w:r>
-        <w:rPr>
-          <w:rFonts w:ascii="Google Sans Code" w:hAnsi="Google Sans Code" w:cs="Courier New"/>
-          <w:sz w:val="20"/>
-          <w:szCs w:val="18"/>
-        </w:rPr>
-        <w:t xml:space="preserve">] </w:t>
-      </w:r>
-      <w:proofErr w:type="spellStart"/>
-      <w:proofErr w:type="gramStart"/>
-      <w:r>
-        <w:rPr>
-          <w:rFonts w:ascii="Google Sans Code" w:hAnsi="Google Sans Code" w:cs="Courier New"/>
-          <w:sz w:val="20"/>
-          <w:szCs w:val="18"/>
-        </w:rPr>
-        <w:t>args</w:t>
-      </w:r>
-      <w:proofErr w:type="spellEnd"/>
-      <w:r>
-        <w:rPr>
-          <w:rFonts w:ascii="Google Sans Code" w:hAnsi="Google Sans Code" w:cs="Courier New"/>
-          <w:sz w:val="20"/>
-          <w:szCs w:val="18"/>
-        </w:rPr>
-        <w:t>) {</w:t>
-      </w:r>
-      <w:proofErr w:type="gramEnd"/>
+        <w:t>public static void main(String[] args) {</w:t>
+      </w:r>
     </w:p>
     <w:p>
       <w:pPr>
@@ -1549,25 +1197,7 @@
           <w:szCs w:val="18"/>
         </w:rPr>
         <w:tab/>
-        <w:t xml:space="preserve">double </w:t>
-      </w:r>
-      <w:proofErr w:type="spellStart"/>
-      <w:r>
-        <w:rPr>
-          <w:rFonts w:ascii="Google Sans Code" w:hAnsi="Google Sans Code" w:cs="Courier New"/>
-          <w:sz w:val="20"/>
-          <w:szCs w:val="18"/>
-        </w:rPr>
-        <w:t>tempf</w:t>
-      </w:r>
-      <w:proofErr w:type="spellEnd"/>
-      <w:r>
-        <w:rPr>
-          <w:rFonts w:ascii="Google Sans Code" w:hAnsi="Google Sans Code" w:cs="Courier New"/>
-          <w:sz w:val="20"/>
-          <w:szCs w:val="18"/>
-        </w:rPr>
-        <w:t xml:space="preserve"> = 98.6;</w:t>
+        <w:t>double tempf = 98.6;</w:t>
       </w:r>
     </w:p>
     <w:p>
@@ -1604,25 +1234,7 @@
           <w:szCs w:val="18"/>
         </w:rPr>
         <w:tab/>
-        <w:t xml:space="preserve">double </w:t>
-      </w:r>
-      <w:proofErr w:type="spellStart"/>
-      <w:r>
-        <w:rPr>
-          <w:rFonts w:ascii="Google Sans Code" w:hAnsi="Google Sans Code" w:cs="Courier New"/>
-          <w:sz w:val="20"/>
-          <w:szCs w:val="18"/>
-        </w:rPr>
-        <w:t>tempc</w:t>
-      </w:r>
-      <w:proofErr w:type="spellEnd"/>
-      <w:r>
-        <w:rPr>
-          <w:rFonts w:ascii="Google Sans Code" w:hAnsi="Google Sans Code" w:cs="Courier New"/>
-          <w:sz w:val="20"/>
-          <w:szCs w:val="18"/>
-        </w:rPr>
-        <w:t xml:space="preserve"> = 0.0;</w:t>
+        <w:t>double tempc = 0.0;</w:t>
       </w:r>
     </w:p>
     <w:p>
@@ -1659,62 +1271,7 @@
           <w:szCs w:val="18"/>
         </w:rPr>
         <w:tab/>
-      </w:r>
-      <w:proofErr w:type="spellStart"/>
-      <w:proofErr w:type="gramStart"/>
-      <w:r>
-        <w:rPr>
-          <w:rFonts w:ascii="Google Sans Code" w:hAnsi="Google Sans Code" w:cs="Courier New"/>
-          <w:sz w:val="20"/>
-          <w:szCs w:val="18"/>
-        </w:rPr>
-        <w:t>ftoc</w:t>
-      </w:r>
-      <w:proofErr w:type="spellEnd"/>
-      <w:r>
-        <w:rPr>
-          <w:rFonts w:ascii="Google Sans Code" w:hAnsi="Google Sans Code" w:cs="Courier New"/>
-          <w:sz w:val="20"/>
-          <w:szCs w:val="18"/>
-        </w:rPr>
-        <w:t>(</w:t>
-      </w:r>
-      <w:proofErr w:type="spellStart"/>
-      <w:proofErr w:type="gramEnd"/>
-      <w:r>
-        <w:rPr>
-          <w:rFonts w:ascii="Google Sans Code" w:hAnsi="Google Sans Code" w:cs="Courier New"/>
-          <w:sz w:val="20"/>
-          <w:szCs w:val="18"/>
-        </w:rPr>
-        <w:t>tempf</w:t>
-      </w:r>
-      <w:proofErr w:type="spellEnd"/>
-      <w:r>
-        <w:rPr>
-          <w:rFonts w:ascii="Google Sans Code" w:hAnsi="Google Sans Code" w:cs="Courier New"/>
-          <w:sz w:val="20"/>
-          <w:szCs w:val="18"/>
-        </w:rPr>
-        <w:t xml:space="preserve">, </w:t>
-      </w:r>
-      <w:proofErr w:type="spellStart"/>
-      <w:r>
-        <w:rPr>
-          <w:rFonts w:ascii="Google Sans Code" w:hAnsi="Google Sans Code" w:cs="Courier New"/>
-          <w:sz w:val="20"/>
-          <w:szCs w:val="18"/>
-        </w:rPr>
-        <w:t>tempc</w:t>
-      </w:r>
-      <w:proofErr w:type="spellEnd"/>
-      <w:r>
-        <w:rPr>
-          <w:rFonts w:ascii="Google Sans Code" w:hAnsi="Google Sans Code" w:cs="Courier New"/>
-          <w:sz w:val="20"/>
-          <w:szCs w:val="18"/>
-        </w:rPr>
-        <w:t>);</w:t>
+        <w:t>ftoc(tempf, tempc);</w:t>
       </w:r>
     </w:p>
     <w:p>
@@ -1751,42 +1308,7 @@
           <w:szCs w:val="18"/>
         </w:rPr>
         <w:tab/>
-      </w:r>
-      <w:proofErr w:type="spellStart"/>
-      <w:r>
-        <w:rPr>
-          <w:rFonts w:ascii="Google Sans Code" w:hAnsi="Google Sans Code" w:cs="Courier New"/>
-          <w:sz w:val="20"/>
-          <w:szCs w:val="18"/>
-        </w:rPr>
-        <w:t>System.out.println</w:t>
-      </w:r>
-      <w:proofErr w:type="spellEnd"/>
-      <w:r>
-        <w:rPr>
-          <w:rFonts w:ascii="Google Sans Code" w:hAnsi="Google Sans Code" w:cs="Courier New"/>
-          <w:sz w:val="20"/>
-          <w:szCs w:val="18"/>
-        </w:rPr>
-        <w:t xml:space="preserve">("Body temp in C is: " + </w:t>
-      </w:r>
-      <w:proofErr w:type="spellStart"/>
-      <w:r>
-        <w:rPr>
-          <w:rFonts w:ascii="Google Sans Code" w:hAnsi="Google Sans Code" w:cs="Courier New"/>
-          <w:sz w:val="20"/>
-          <w:szCs w:val="18"/>
-        </w:rPr>
-        <w:t>tempc</w:t>
-      </w:r>
-      <w:proofErr w:type="spellEnd"/>
-      <w:r>
-        <w:rPr>
-          <w:rFonts w:ascii="Google Sans Code" w:hAnsi="Google Sans Code" w:cs="Courier New"/>
-          <w:sz w:val="20"/>
-          <w:szCs w:val="18"/>
-        </w:rPr>
-        <w:t>);</w:t>
+        <w:t>System.out.println("Body temp in C is: " + tempc);</w:t>
       </w:r>
     </w:p>
     <w:p>
@@ -1893,74 +1415,8 @@
           <w:szCs w:val="18"/>
         </w:rPr>
         <w:tab/>
-        <w:t xml:space="preserve">public static void </w:t>
-      </w:r>
-      <w:proofErr w:type="spellStart"/>
-      <w:proofErr w:type="gramStart"/>
-      <w:r>
-        <w:rPr>
-          <w:rFonts w:ascii="Google Sans Code" w:hAnsi="Google Sans Code" w:cs="Courier New"/>
-          <w:sz w:val="20"/>
-          <w:szCs w:val="18"/>
-        </w:rPr>
-        <w:t>ftoc</w:t>
-      </w:r>
-      <w:proofErr w:type="spellEnd"/>
-      <w:r>
-        <w:rPr>
-          <w:rFonts w:ascii="Google Sans Code" w:hAnsi="Google Sans Code" w:cs="Courier New"/>
-          <w:sz w:val="20"/>
-          <w:szCs w:val="18"/>
-        </w:rPr>
-        <w:t>(</w:t>
-      </w:r>
-      <w:proofErr w:type="gramEnd"/>
-      <w:r>
-        <w:rPr>
-          <w:rFonts w:ascii="Google Sans Code" w:hAnsi="Google Sans Code" w:cs="Courier New"/>
-          <w:sz w:val="20"/>
-          <w:szCs w:val="18"/>
-        </w:rPr>
-        <w:t xml:space="preserve">double </w:t>
-      </w:r>
-      <w:proofErr w:type="spellStart"/>
-      <w:r>
-        <w:rPr>
-          <w:rFonts w:ascii="Google Sans Code" w:hAnsi="Google Sans Code" w:cs="Courier New"/>
-          <w:sz w:val="20"/>
-          <w:szCs w:val="18"/>
-        </w:rPr>
-        <w:t>tempf</w:t>
-      </w:r>
-      <w:proofErr w:type="spellEnd"/>
-      <w:r>
-        <w:rPr>
-          <w:rFonts w:ascii="Google Sans Code" w:hAnsi="Google Sans Code" w:cs="Courier New"/>
-          <w:sz w:val="20"/>
-          <w:szCs w:val="18"/>
-        </w:rPr>
-        <w:t xml:space="preserve">, double </w:t>
-      </w:r>
-      <w:proofErr w:type="spellStart"/>
-      <w:proofErr w:type="gramStart"/>
-      <w:r>
-        <w:rPr>
-          <w:rFonts w:ascii="Google Sans Code" w:hAnsi="Google Sans Code" w:cs="Courier New"/>
-          <w:sz w:val="20"/>
-          <w:szCs w:val="18"/>
-        </w:rPr>
-        <w:t>tempc</w:t>
-      </w:r>
-      <w:proofErr w:type="spellEnd"/>
-      <w:r>
-        <w:rPr>
-          <w:rFonts w:ascii="Google Sans Code" w:hAnsi="Google Sans Code" w:cs="Courier New"/>
-          <w:sz w:val="20"/>
-          <w:szCs w:val="18"/>
-        </w:rPr>
-        <w:t>) {</w:t>
-      </w:r>
-      <w:proofErr w:type="gramEnd"/>
+        <w:t>public static void ftoc(double tempf, double tempc) {</w:t>
+      </w:r>
     </w:p>
     <w:p>
       <w:pPr>
@@ -1996,42 +1452,7 @@
           <w:szCs w:val="18"/>
         </w:rPr>
         <w:tab/>
-      </w:r>
-      <w:proofErr w:type="spellStart"/>
-      <w:r>
-        <w:rPr>
-          <w:rFonts w:ascii="Google Sans Code" w:hAnsi="Google Sans Code" w:cs="Courier New"/>
-          <w:sz w:val="20"/>
-          <w:szCs w:val="18"/>
-        </w:rPr>
-        <w:t>tempc</w:t>
-      </w:r>
-      <w:proofErr w:type="spellEnd"/>
-      <w:r>
-        <w:rPr>
-          <w:rFonts w:ascii="Google Sans Code" w:hAnsi="Google Sans Code" w:cs="Courier New"/>
-          <w:sz w:val="20"/>
-          <w:szCs w:val="18"/>
-        </w:rPr>
-        <w:t xml:space="preserve"> = (</w:t>
-      </w:r>
-      <w:proofErr w:type="spellStart"/>
-      <w:r>
-        <w:rPr>
-          <w:rFonts w:ascii="Google Sans Code" w:hAnsi="Google Sans Code" w:cs="Courier New"/>
-          <w:sz w:val="20"/>
-          <w:szCs w:val="18"/>
-        </w:rPr>
-        <w:t>tempf</w:t>
-      </w:r>
-      <w:proofErr w:type="spellEnd"/>
-      <w:r>
-        <w:rPr>
-          <w:rFonts w:ascii="Google Sans Code" w:hAnsi="Google Sans Code" w:cs="Courier New"/>
-          <w:sz w:val="20"/>
-          <w:szCs w:val="18"/>
-        </w:rPr>
-        <w:t xml:space="preserve"> - 32) * 5 / 9;</w:t>
+        <w:t>tempc = (tempf - 32) * 5 / 9;</w:t>
       </w:r>
     </w:p>
     <w:p>
@@ -2118,15 +1539,7 @@
           <w:b/>
           <w:sz w:val="24"/>
         </w:rPr>
-        <w:t xml:space="preserve">Code </w:t>
-      </w:r>
-      <w:r>
-        <w:rPr>
-          <w:rFonts w:ascii="Gabarito" w:hAnsi="Gabarito" w:cstheme="minorHAnsi"/>
-          <w:b/>
-          <w:sz w:val="24"/>
-        </w:rPr>
-        <w:t>4</w:t>
+        <w:t>Code 4</w:t>
       </w:r>
     </w:p>
     <w:p>
@@ -2186,43 +1599,7 @@
           <w:sz w:val="20"/>
           <w:szCs w:val="18"/>
         </w:rPr>
-        <w:t xml:space="preserve"> public Static main (</w:t>
-      </w:r>
-      <w:proofErr w:type="gramStart"/>
-      <w:r>
-        <w:rPr>
-          <w:rFonts w:ascii="Google Sans Code" w:hAnsi="Google Sans Code" w:cs="Courier New"/>
-          <w:sz w:val="20"/>
-          <w:szCs w:val="18"/>
-        </w:rPr>
-        <w:t>string[</w:t>
-      </w:r>
-      <w:proofErr w:type="gramEnd"/>
-      <w:r>
-        <w:rPr>
-          <w:rFonts w:ascii="Google Sans Code" w:hAnsi="Google Sans Code" w:cs="Courier New"/>
-          <w:sz w:val="20"/>
-          <w:szCs w:val="18"/>
-        </w:rPr>
-        <w:t xml:space="preserve">] </w:t>
-      </w:r>
-      <w:proofErr w:type="spellStart"/>
-      <w:r>
-        <w:rPr>
-          <w:rFonts w:ascii="Google Sans Code" w:hAnsi="Google Sans Code" w:cs="Courier New"/>
-          <w:sz w:val="20"/>
-          <w:szCs w:val="18"/>
-        </w:rPr>
-        <w:t>args</w:t>
-      </w:r>
-      <w:proofErr w:type="spellEnd"/>
-      <w:r>
-        <w:rPr>
-          <w:rFonts w:ascii="Google Sans Code" w:hAnsi="Google Sans Code" w:cs="Courier New"/>
-          <w:sz w:val="20"/>
-          <w:szCs w:val="18"/>
-        </w:rPr>
-        <w:t>)</w:t>
+        <w:t xml:space="preserve"> public Static main (string[] args)</w:t>
       </w:r>
     </w:p>
     <w:p>
@@ -2262,25 +1639,7 @@
           <w:sz w:val="20"/>
           <w:szCs w:val="18"/>
         </w:rPr>
-        <w:t xml:space="preserve"> </w:t>
-      </w:r>
-      <w:proofErr w:type="spellStart"/>
-      <w:r>
-        <w:rPr>
-          <w:rFonts w:ascii="Google Sans Code" w:hAnsi="Google Sans Code" w:cs="Courier New"/>
-          <w:sz w:val="20"/>
-          <w:szCs w:val="18"/>
-        </w:rPr>
-        <w:t>System.out.println</w:t>
-      </w:r>
-      <w:proofErr w:type="spellEnd"/>
-      <w:r>
-        <w:rPr>
-          <w:rFonts w:ascii="Google Sans Code" w:hAnsi="Google Sans Code" w:cs="Courier New"/>
-          <w:sz w:val="20"/>
-          <w:szCs w:val="18"/>
-        </w:rPr>
-        <w:t xml:space="preserve"> ("!!!!!!!!!!!!!!!!!!!!!!!!!!!!!!!!!!!!!!!!!!!");</w:t>
+        <w:t xml:space="preserve"> System.out.println ("!!!!!!!!!!!!!!!!!!!!!!!!!!!!!!!!!!!!!!!!!!!");</w:t>
       </w:r>
     </w:p>
     <w:p>
@@ -2300,25 +1659,7 @@
           <w:sz w:val="20"/>
           <w:szCs w:val="18"/>
         </w:rPr>
-        <w:t xml:space="preserve"> </w:t>
-      </w:r>
-      <w:proofErr w:type="spellStart"/>
-      <w:r>
-        <w:rPr>
-          <w:rFonts w:ascii="Google Sans Code" w:hAnsi="Google Sans Code" w:cs="Courier New"/>
-          <w:sz w:val="20"/>
-          <w:szCs w:val="18"/>
-        </w:rPr>
-        <w:t>System.out.println</w:t>
-      </w:r>
-      <w:proofErr w:type="spellEnd"/>
-      <w:r>
-        <w:rPr>
-          <w:rFonts w:ascii="Google Sans Code" w:hAnsi="Google Sans Code" w:cs="Courier New"/>
-          <w:sz w:val="20"/>
-          <w:szCs w:val="18"/>
-        </w:rPr>
-        <w:t xml:space="preserve"> (This program used to have lots of problems,");</w:t>
+        <w:t xml:space="preserve"> System.out.println (This program used to have lots of problems,");</w:t>
       </w:r>
     </w:p>
     <w:p>
@@ -2338,16 +1679,7 @@
           <w:sz w:val="20"/>
           <w:szCs w:val="18"/>
         </w:rPr>
-        <w:t xml:space="preserve"> </w:t>
-      </w:r>
-      <w:proofErr w:type="gramStart"/>
-      <w:r>
-        <w:rPr>
-          <w:rFonts w:ascii="Google Sans Code" w:hAnsi="Google Sans Code" w:cs="Courier New"/>
-          <w:sz w:val="20"/>
-          <w:szCs w:val="18"/>
-        </w:rPr>
-        <w:t>System.0</w:t>
+        <w:t xml:space="preserve"> System.0</w:t>
       </w:r>
       <w:r>
         <w:rPr>
@@ -2363,16 +1695,7 @@
           <w:sz w:val="20"/>
           <w:szCs w:val="18"/>
         </w:rPr>
-        <w:t>ut.println</w:t>
-      </w:r>
-      <w:proofErr w:type="gramEnd"/>
-      <w:r>
-        <w:rPr>
-          <w:rFonts w:ascii="Google Sans Code" w:hAnsi="Google Sans Code" w:cs="Courier New"/>
-          <w:sz w:val="20"/>
-          <w:szCs w:val="18"/>
-        </w:rPr>
-        <w:t xml:space="preserve"> ("but if it prints this, you fixed them all.")</w:t>
+        <w:t>ut.println ("but if it prints this, you fixed them all.")</w:t>
       </w:r>
     </w:p>
     <w:p>
@@ -2392,25 +1715,7 @@
           <w:sz w:val="20"/>
           <w:szCs w:val="18"/>
         </w:rPr>
-        <w:t xml:space="preserve"> </w:t>
-      </w:r>
-      <w:proofErr w:type="spellStart"/>
-      <w:r>
-        <w:rPr>
-          <w:rFonts w:ascii="Google Sans Code" w:hAnsi="Google Sans Code" w:cs="Courier New"/>
-          <w:sz w:val="20"/>
-          <w:szCs w:val="18"/>
-        </w:rPr>
-        <w:t>System.out.println</w:t>
-      </w:r>
-      <w:proofErr w:type="spellEnd"/>
-      <w:r>
-        <w:rPr>
-          <w:rFonts w:ascii="Google Sans Code" w:hAnsi="Google Sans Code" w:cs="Courier New"/>
-          <w:sz w:val="20"/>
-          <w:szCs w:val="18"/>
-        </w:rPr>
-        <w:t xml:space="preserve"> (" *** Hurray! ***);</w:t>
+        <w:t xml:space="preserve"> System.out.println (" *** Hurray! ***);</w:t>
       </w:r>
     </w:p>
     <w:p>
@@ -2430,25 +1735,7 @@
           <w:sz w:val="20"/>
           <w:szCs w:val="18"/>
         </w:rPr>
-        <w:t xml:space="preserve"> </w:t>
-      </w:r>
-      <w:proofErr w:type="spellStart"/>
-      <w:r>
-        <w:rPr>
-          <w:rFonts w:ascii="Google Sans Code" w:hAnsi="Google Sans Code" w:cs="Courier New"/>
-          <w:sz w:val="20"/>
-          <w:szCs w:val="18"/>
-        </w:rPr>
-        <w:t>System.out.println</w:t>
-      </w:r>
-      <w:proofErr w:type="spellEnd"/>
-      <w:r>
-        <w:rPr>
-          <w:rFonts w:ascii="Google Sans Code" w:hAnsi="Google Sans Code" w:cs="Courier New"/>
-          <w:sz w:val="20"/>
-          <w:szCs w:val="18"/>
-        </w:rPr>
-        <w:t xml:space="preserve"> ("!!!!!!!!!!!!!!!!!!!!!!!!!!!!!!!!!!!!!!!!!!!");</w:t>
+        <w:t xml:space="preserve"> System.out.println ("!!!!!!!!!!!!!!!!!!!!!!!!!!!!!!!!!!!!!!!!!!!");</w:t>
       </w:r>
     </w:p>
     <w:p>
@@ -2527,15 +1814,7 @@
           <w:b/>
           <w:sz w:val="24"/>
         </w:rPr>
-        <w:t xml:space="preserve">Code </w:t>
-      </w:r>
-      <w:r>
-        <w:rPr>
-          <w:rFonts w:ascii="Gabarito" w:hAnsi="Gabarito" w:cstheme="minorHAnsi"/>
-          <w:b/>
-          <w:sz w:val="24"/>
-        </w:rPr>
-        <w:t>5</w:t>
+        <w:t>Code 5</w:t>
       </w:r>
     </w:p>
     <w:p>
@@ -2549,23 +1828,13 @@
           <w:szCs w:val="18"/>
         </w:rPr>
       </w:pPr>
-      <w:proofErr w:type="gramStart"/>
-      <w:r>
-        <w:rPr>
-          <w:rFonts w:ascii="Google Sans Code" w:hAnsi="Google Sans Code" w:cs="Courier New"/>
-          <w:sz w:val="20"/>
-          <w:szCs w:val="18"/>
-        </w:rPr>
-        <w:t>public</w:t>
-      </w:r>
-      <w:proofErr w:type="gramEnd"/>
-      <w:r>
-        <w:rPr>
-          <w:rFonts w:ascii="Google Sans Code" w:hAnsi="Google Sans Code" w:cs="Courier New"/>
-          <w:sz w:val="20"/>
-          <w:szCs w:val="18"/>
-        </w:rPr>
-        <w:t xml:space="preserve"> class Parameters {</w:t>
+      <w:r>
+        <w:rPr>
+          <w:rFonts w:ascii="Google Sans Code" w:hAnsi="Google Sans Code" w:cs="Courier New"/>
+          <w:sz w:val="20"/>
+          <w:szCs w:val="18"/>
+        </w:rPr>
+        <w:t>public class Parameters {</w:t>
       </w:r>
     </w:p>
     <w:p>
@@ -2585,25 +1854,7 @@
           <w:sz w:val="20"/>
           <w:szCs w:val="18"/>
         </w:rPr>
-        <w:t xml:space="preserve">    public static void </w:t>
-      </w:r>
-      <w:proofErr w:type="gramStart"/>
-      <w:r>
-        <w:rPr>
-          <w:rFonts w:ascii="Google Sans Code" w:hAnsi="Google Sans Code" w:cs="Courier New"/>
-          <w:sz w:val="20"/>
-          <w:szCs w:val="18"/>
-        </w:rPr>
-        <w:t>main(</w:t>
-      </w:r>
-      <w:proofErr w:type="gramEnd"/>
-      <w:r>
-        <w:rPr>
-          <w:rFonts w:ascii="Google Sans Code" w:hAnsi="Google Sans Code" w:cs="Courier New"/>
-          <w:sz w:val="20"/>
-          <w:szCs w:val="18"/>
-        </w:rPr>
-        <w:t>) {</w:t>
+        <w:t xml:space="preserve">    public static void main() {</w:t>
       </w:r>
     </w:p>
     <w:p>
@@ -2663,25 +1914,7 @@
           <w:sz w:val="20"/>
           <w:szCs w:val="18"/>
         </w:rPr>
-        <w:t xml:space="preserve">        </w:t>
-      </w:r>
-      <w:proofErr w:type="gramStart"/>
-      <w:r>
-        <w:rPr>
-          <w:rFonts w:ascii="Google Sans Code" w:hAnsi="Google Sans Code" w:cs="Courier New"/>
-          <w:sz w:val="20"/>
-          <w:szCs w:val="18"/>
-        </w:rPr>
-        <w:t>printer(</w:t>
-      </w:r>
-      <w:proofErr w:type="gramEnd"/>
-      <w:r>
-        <w:rPr>
-          <w:rFonts w:ascii="Google Sans Code" w:hAnsi="Google Sans Code" w:cs="Courier New"/>
-          <w:sz w:val="20"/>
-          <w:szCs w:val="18"/>
-        </w:rPr>
-        <w:t>double x, double y);</w:t>
+        <w:t xml:space="preserve">        printer(double x, double y);</w:t>
       </w:r>
     </w:p>
     <w:p>
@@ -2721,61 +1954,7 @@
           <w:sz w:val="20"/>
           <w:szCs w:val="18"/>
         </w:rPr>
-        <w:t xml:space="preserve">        </w:t>
-      </w:r>
-      <w:proofErr w:type="gramStart"/>
-      <w:r>
-        <w:rPr>
-          <w:rFonts w:ascii="Google Sans Code" w:hAnsi="Google Sans Code" w:cs="Courier New"/>
-          <w:sz w:val="20"/>
-          <w:szCs w:val="18"/>
-        </w:rPr>
-        <w:t>printer(</w:t>
-      </w:r>
-      <w:proofErr w:type="gramEnd"/>
-      <w:r>
-        <w:rPr>
-          <w:rFonts w:ascii="Google Sans Code" w:hAnsi="Google Sans Code" w:cs="Courier New"/>
-          <w:sz w:val="20"/>
-          <w:szCs w:val="18"/>
-        </w:rPr>
-        <w:t>"</w:t>
-      </w:r>
-      <w:proofErr w:type="spellStart"/>
-      <w:r>
-        <w:rPr>
-          <w:rFonts w:ascii="Google Sans Code" w:hAnsi="Google Sans Code" w:cs="Courier New"/>
-          <w:sz w:val="20"/>
-          <w:szCs w:val="18"/>
-        </w:rPr>
-        <w:t>barack</w:t>
-      </w:r>
-      <w:proofErr w:type="spellEnd"/>
-      <w:r>
-        <w:rPr>
-          <w:rFonts w:ascii="Google Sans Code" w:hAnsi="Google Sans Code" w:cs="Courier New"/>
-          <w:sz w:val="20"/>
-          <w:szCs w:val="18"/>
-        </w:rPr>
-        <w:t>", "</w:t>
-      </w:r>
-      <w:proofErr w:type="spellStart"/>
-      <w:r>
-        <w:rPr>
-          <w:rFonts w:ascii="Google Sans Code" w:hAnsi="Google Sans Code" w:cs="Courier New"/>
-          <w:sz w:val="20"/>
-          <w:szCs w:val="18"/>
-        </w:rPr>
-        <w:t>obama</w:t>
-      </w:r>
-      <w:proofErr w:type="spellEnd"/>
-      <w:r>
-        <w:rPr>
-          <w:rFonts w:ascii="Google Sans Code" w:hAnsi="Google Sans Code" w:cs="Courier New"/>
-          <w:sz w:val="20"/>
-          <w:szCs w:val="18"/>
-        </w:rPr>
-        <w:t>");</w:t>
+        <w:t xml:space="preserve">        printer("barack", "obama");</w:t>
       </w:r>
     </w:p>
     <w:p>
@@ -2795,25 +1974,7 @@
           <w:sz w:val="20"/>
           <w:szCs w:val="18"/>
         </w:rPr>
-        <w:t xml:space="preserve">        </w:t>
-      </w:r>
-      <w:proofErr w:type="spellStart"/>
-      <w:r>
-        <w:rPr>
-          <w:rFonts w:ascii="Google Sans Code" w:hAnsi="Google Sans Code" w:cs="Courier New"/>
-          <w:sz w:val="20"/>
-          <w:szCs w:val="18"/>
-        </w:rPr>
-        <w:t>System.out.println</w:t>
-      </w:r>
-      <w:proofErr w:type="spellEnd"/>
-      <w:r>
-        <w:rPr>
-          <w:rFonts w:ascii="Google Sans Code" w:hAnsi="Google Sans Code" w:cs="Courier New"/>
-          <w:sz w:val="20"/>
-          <w:szCs w:val="18"/>
-        </w:rPr>
-        <w:t>("z = " + z);</w:t>
+        <w:t xml:space="preserve">        System.out.println("z = " + z);</w:t>
       </w:r>
     </w:p>
     <w:p>
@@ -2865,36 +2026,8 @@
           <w:sz w:val="20"/>
           <w:szCs w:val="18"/>
         </w:rPr>
-        <w:t xml:space="preserve">    public static void </w:t>
-      </w:r>
-      <w:proofErr w:type="gramStart"/>
-      <w:r>
-        <w:rPr>
-          <w:rFonts w:ascii="Google Sans Code" w:hAnsi="Google Sans Code" w:cs="Courier New"/>
-          <w:sz w:val="20"/>
-          <w:szCs w:val="18"/>
-        </w:rPr>
-        <w:t>printer(</w:t>
-      </w:r>
-      <w:proofErr w:type="gramEnd"/>
-      <w:r>
-        <w:rPr>
-          <w:rFonts w:ascii="Google Sans Code" w:hAnsi="Google Sans Code" w:cs="Courier New"/>
-          <w:sz w:val="20"/>
-          <w:szCs w:val="18"/>
-        </w:rPr>
-        <w:t xml:space="preserve">x, y </w:t>
-      </w:r>
-      <w:proofErr w:type="gramStart"/>
-      <w:r>
-        <w:rPr>
-          <w:rFonts w:ascii="Google Sans Code" w:hAnsi="Google Sans Code" w:cs="Courier New"/>
-          <w:sz w:val="20"/>
-          <w:szCs w:val="18"/>
-        </w:rPr>
-        <w:t>double) {</w:t>
-      </w:r>
-      <w:proofErr w:type="gramEnd"/>
+        <w:t xml:space="preserve">    public static void printer(x, y double) {</w:t>
+      </w:r>
     </w:p>
     <w:p>
       <w:pPr>
@@ -2933,25 +2066,7 @@
           <w:sz w:val="20"/>
           <w:szCs w:val="18"/>
         </w:rPr>
-        <w:t xml:space="preserve">        </w:t>
-      </w:r>
-      <w:proofErr w:type="spellStart"/>
-      <w:r>
-        <w:rPr>
-          <w:rFonts w:ascii="Google Sans Code" w:hAnsi="Google Sans Code" w:cs="Courier New"/>
-          <w:sz w:val="20"/>
-          <w:szCs w:val="18"/>
-        </w:rPr>
-        <w:t>System.out.println</w:t>
-      </w:r>
-      <w:proofErr w:type="spellEnd"/>
-      <w:r>
-        <w:rPr>
-          <w:rFonts w:ascii="Google Sans Code" w:hAnsi="Google Sans Code" w:cs="Courier New"/>
-          <w:sz w:val="20"/>
-          <w:szCs w:val="18"/>
-        </w:rPr>
-        <w:t>("x = " + double x + " and y = " + y);</w:t>
+        <w:t xml:space="preserve">        System.out.println("x = " + double x + " and y = " + y);</w:t>
       </w:r>
     </w:p>
     <w:p>
@@ -2971,25 +2086,7 @@
           <w:sz w:val="20"/>
           <w:szCs w:val="18"/>
         </w:rPr>
-        <w:t xml:space="preserve">        </w:t>
-      </w:r>
-      <w:proofErr w:type="spellStart"/>
-      <w:r>
-        <w:rPr>
-          <w:rFonts w:ascii="Google Sans Code" w:hAnsi="Google Sans Code" w:cs="Courier New"/>
-          <w:sz w:val="20"/>
-          <w:szCs w:val="18"/>
-        </w:rPr>
-        <w:t>System.out.println</w:t>
-      </w:r>
-      <w:proofErr w:type="spellEnd"/>
-      <w:r>
-        <w:rPr>
-          <w:rFonts w:ascii="Google Sans Code" w:hAnsi="Google Sans Code" w:cs="Courier New"/>
-          <w:sz w:val="20"/>
-          <w:szCs w:val="18"/>
-        </w:rPr>
-        <w:t>("The value from main is: " + bubble);</w:t>
+        <w:t xml:space="preserve">        System.out.println("The value from main is: " + bubble);</w:t>
       </w:r>
     </w:p>
     <w:p>
@@ -3068,15 +2165,7 @@
           <w:b/>
           <w:sz w:val="24"/>
         </w:rPr>
-        <w:t xml:space="preserve">Code </w:t>
-      </w:r>
-      <w:r>
-        <w:rPr>
-          <w:rFonts w:ascii="Gabarito" w:hAnsi="Gabarito" w:cstheme="minorHAnsi"/>
-          <w:b/>
-          <w:sz w:val="24"/>
-        </w:rPr>
-        <w:t>6</w:t>
+        <w:t>Code 6</w:t>
       </w:r>
     </w:p>
     <w:p>
@@ -3136,36 +2225,8 @@
           <w:sz w:val="20"/>
           <w:szCs w:val="18"/>
         </w:rPr>
-        <w:t xml:space="preserve">private void </w:t>
-      </w:r>
-      <w:proofErr w:type="gramStart"/>
-      <w:r>
-        <w:rPr>
-          <w:rFonts w:ascii="Google Sans Code" w:hAnsi="Google Sans Code" w:cs="Courier New"/>
-          <w:sz w:val="20"/>
-          <w:szCs w:val="18"/>
-        </w:rPr>
-        <w:t>f(</w:t>
-      </w:r>
-      <w:proofErr w:type="gramEnd"/>
-      <w:r>
-        <w:rPr>
-          <w:rFonts w:ascii="Google Sans Code" w:hAnsi="Google Sans Code" w:cs="Courier New"/>
-          <w:sz w:val="20"/>
-          <w:szCs w:val="18"/>
-        </w:rPr>
-        <w:t xml:space="preserve">int </w:t>
-      </w:r>
-      <w:proofErr w:type="gramStart"/>
-      <w:r>
-        <w:rPr>
-          <w:rFonts w:ascii="Google Sans Code" w:hAnsi="Google Sans Code" w:cs="Courier New"/>
-          <w:sz w:val="20"/>
-          <w:szCs w:val="18"/>
-        </w:rPr>
-        <w:t>x) {</w:t>
-      </w:r>
-      <w:proofErr w:type="gramEnd"/>
+        <w:t>private void f(int x) {</w:t>
+      </w:r>
     </w:p>
     <w:p>
       <w:pPr>
@@ -3198,23 +2259,13 @@
           <w:szCs w:val="18"/>
         </w:rPr>
       </w:pPr>
-      <w:proofErr w:type="gramStart"/>
-      <w:r>
-        <w:rPr>
-          <w:rFonts w:ascii="Google Sans Code" w:hAnsi="Google Sans Code" w:cs="Courier New"/>
-          <w:sz w:val="20"/>
-          <w:szCs w:val="18"/>
-        </w:rPr>
-        <w:t>g(</w:t>
-      </w:r>
-      <w:proofErr w:type="gramEnd"/>
-      <w:r>
-        <w:rPr>
-          <w:rFonts w:ascii="Google Sans Code" w:hAnsi="Google Sans Code" w:cs="Courier New"/>
-          <w:sz w:val="20"/>
-          <w:szCs w:val="18"/>
-        </w:rPr>
-        <w:t>);</w:t>
+      <w:r>
+        <w:rPr>
+          <w:rFonts w:ascii="Google Sans Code" w:hAnsi="Google Sans Code" w:cs="Courier New"/>
+          <w:sz w:val="20"/>
+          <w:szCs w:val="18"/>
+        </w:rPr>
+        <w:t>g();</w:t>
       </w:r>
     </w:p>
     <w:p>
@@ -3254,25 +2305,7 @@
           <w:sz w:val="20"/>
           <w:szCs w:val="18"/>
         </w:rPr>
-        <w:t xml:space="preserve">private void </w:t>
-      </w:r>
-      <w:proofErr w:type="gramStart"/>
-      <w:r>
-        <w:rPr>
-          <w:rFonts w:ascii="Google Sans Code" w:hAnsi="Google Sans Code" w:cs="Courier New"/>
-          <w:sz w:val="20"/>
-          <w:szCs w:val="18"/>
-        </w:rPr>
-        <w:t>g(</w:t>
-      </w:r>
-      <w:proofErr w:type="gramEnd"/>
-      <w:r>
-        <w:rPr>
-          <w:rFonts w:ascii="Google Sans Code" w:hAnsi="Google Sans Code" w:cs="Courier New"/>
-          <w:sz w:val="20"/>
-          <w:szCs w:val="18"/>
-        </w:rPr>
-        <w:t>) {</w:t>
+        <w:t>private void g() {</w:t>
       </w:r>
     </w:p>
     <w:p>
@@ -3286,23 +2319,13 @@
           <w:szCs w:val="18"/>
         </w:rPr>
       </w:pPr>
-      <w:proofErr w:type="spellStart"/>
-      <w:r>
-        <w:rPr>
-          <w:rFonts w:ascii="Google Sans Code" w:hAnsi="Google Sans Code" w:cs="Courier New"/>
-          <w:sz w:val="20"/>
-          <w:szCs w:val="18"/>
-        </w:rPr>
-        <w:t>System.out.println</w:t>
-      </w:r>
-      <w:proofErr w:type="spellEnd"/>
-      <w:r>
-        <w:rPr>
-          <w:rFonts w:ascii="Google Sans Code" w:hAnsi="Google Sans Code" w:cs="Courier New"/>
-          <w:sz w:val="20"/>
-          <w:szCs w:val="18"/>
-        </w:rPr>
-        <w:t>(x);</w:t>
+      <w:r>
+        <w:rPr>
+          <w:rFonts w:ascii="Google Sans Code" w:hAnsi="Google Sans Code" w:cs="Courier New"/>
+          <w:sz w:val="20"/>
+          <w:szCs w:val="18"/>
+        </w:rPr>
+        <w:t>System.out.println(x);</w:t>
       </w:r>
     </w:p>
     <w:p>
@@ -3342,46 +2365,8 @@
           <w:sz w:val="20"/>
           <w:szCs w:val="18"/>
         </w:rPr>
-        <w:t xml:space="preserve">public static void </w:t>
-      </w:r>
-      <w:proofErr w:type="gramStart"/>
-      <w:r>
-        <w:rPr>
-          <w:rFonts w:ascii="Google Sans Code" w:hAnsi="Google Sans Code" w:cs="Courier New"/>
-          <w:sz w:val="20"/>
-          <w:szCs w:val="18"/>
-        </w:rPr>
-        <w:t>main(String[</w:t>
-      </w:r>
-      <w:proofErr w:type="gramEnd"/>
-      <w:r>
-        <w:rPr>
-          <w:rFonts w:ascii="Google Sans Code" w:hAnsi="Google Sans Code" w:cs="Courier New"/>
-          <w:sz w:val="20"/>
-          <w:szCs w:val="18"/>
-        </w:rPr>
-        <w:t xml:space="preserve">] </w:t>
-      </w:r>
-      <w:proofErr w:type="spellStart"/>
-      <w:proofErr w:type="gramStart"/>
-      <w:r>
-        <w:rPr>
-          <w:rFonts w:ascii="Google Sans Code" w:hAnsi="Google Sans Code" w:cs="Courier New"/>
-          <w:sz w:val="20"/>
-          <w:szCs w:val="18"/>
-        </w:rPr>
-        <w:t>args</w:t>
-      </w:r>
-      <w:proofErr w:type="spellEnd"/>
-      <w:r>
-        <w:rPr>
-          <w:rFonts w:ascii="Google Sans Code" w:hAnsi="Google Sans Code" w:cs="Courier New"/>
-          <w:sz w:val="20"/>
-          <w:szCs w:val="18"/>
-        </w:rPr>
-        <w:t>) {</w:t>
-      </w:r>
-      <w:proofErr w:type="gramEnd"/>
+        <w:t>public static void main(String[] args) {</w:t>
+      </w:r>
     </w:p>
     <w:p>
       <w:pPr>
@@ -3401,25 +2386,7 @@
           <w:szCs w:val="18"/>
         </w:rPr>
         <w:lastRenderedPageBreak/>
-        <w:t xml:space="preserve">exercise e = new </w:t>
-      </w:r>
-      <w:proofErr w:type="gramStart"/>
-      <w:r>
-        <w:rPr>
-          <w:rFonts w:ascii="Google Sans Code" w:hAnsi="Google Sans Code" w:cs="Courier New"/>
-          <w:sz w:val="20"/>
-          <w:szCs w:val="18"/>
-        </w:rPr>
-        <w:t>exercise(</w:t>
-      </w:r>
-      <w:proofErr w:type="gramEnd"/>
-      <w:r>
-        <w:rPr>
-          <w:rFonts w:ascii="Google Sans Code" w:hAnsi="Google Sans Code" w:cs="Courier New"/>
-          <w:sz w:val="20"/>
-          <w:szCs w:val="18"/>
-        </w:rPr>
-        <w:t>);</w:t>
+        <w:t>exercise e = new exercise();</w:t>
       </w:r>
     </w:p>
     <w:p>
@@ -3453,23 +2420,13 @@
           <w:szCs w:val="18"/>
         </w:rPr>
       </w:pPr>
-      <w:proofErr w:type="spellStart"/>
-      <w:r>
-        <w:rPr>
-          <w:rFonts w:ascii="Google Sans Code" w:hAnsi="Google Sans Code" w:cs="Courier New"/>
-          <w:sz w:val="20"/>
-          <w:szCs w:val="18"/>
-        </w:rPr>
-        <w:t>e.f</w:t>
-      </w:r>
-      <w:proofErr w:type="spellEnd"/>
-      <w:r>
-        <w:rPr>
-          <w:rFonts w:ascii="Google Sans Code" w:hAnsi="Google Sans Code" w:cs="Courier New"/>
-          <w:sz w:val="20"/>
-          <w:szCs w:val="18"/>
-        </w:rPr>
-        <w:t>(x);</w:t>
+      <w:r>
+        <w:rPr>
+          <w:rFonts w:ascii="Google Sans Code" w:hAnsi="Google Sans Code" w:cs="Courier New"/>
+          <w:sz w:val="20"/>
+          <w:szCs w:val="18"/>
+        </w:rPr>
+        <w:t>e.f(x);</w:t>
       </w:r>
     </w:p>
     <w:p>
@@ -3548,15 +2505,7 @@
           <w:b/>
           <w:sz w:val="24"/>
         </w:rPr>
-        <w:t xml:space="preserve">Code </w:t>
-      </w:r>
-      <w:r>
-        <w:rPr>
-          <w:rFonts w:ascii="Gabarito" w:hAnsi="Gabarito" w:cstheme="minorHAnsi"/>
-          <w:b/>
-          <w:sz w:val="24"/>
-        </w:rPr>
-        <w:t>7</w:t>
+        <w:t>Code 7</w:t>
       </w:r>
     </w:p>
     <w:p>
@@ -3596,43 +2545,7 @@
           <w:sz w:val="20"/>
           <w:szCs w:val="18"/>
         </w:rPr>
-        <w:t xml:space="preserve">    public static </w:t>
-      </w:r>
-      <w:proofErr w:type="gramStart"/>
-      <w:r>
-        <w:rPr>
-          <w:rFonts w:ascii="Google Sans Code" w:hAnsi="Google Sans Code" w:cs="Courier New"/>
-          <w:sz w:val="20"/>
-          <w:szCs w:val="18"/>
-        </w:rPr>
-        <w:t>main(</w:t>
-      </w:r>
-      <w:proofErr w:type="gramEnd"/>
-      <w:r>
-        <w:rPr>
-          <w:rFonts w:ascii="Google Sans Code" w:hAnsi="Google Sans Code" w:cs="Courier New"/>
-          <w:sz w:val="20"/>
-          <w:szCs w:val="18"/>
-        </w:rPr>
-        <w:t xml:space="preserve">String </w:t>
-      </w:r>
-      <w:proofErr w:type="spellStart"/>
-      <w:r>
-        <w:rPr>
-          <w:rFonts w:ascii="Google Sans Code" w:hAnsi="Google Sans Code" w:cs="Courier New"/>
-          <w:sz w:val="20"/>
-          <w:szCs w:val="18"/>
-        </w:rPr>
-        <w:t>args</w:t>
-      </w:r>
-      <w:proofErr w:type="spellEnd"/>
-      <w:r>
-        <w:rPr>
-          <w:rFonts w:ascii="Google Sans Code" w:hAnsi="Google Sans Code" w:cs="Courier New"/>
-          <w:sz w:val="20"/>
-          <w:szCs w:val="18"/>
-        </w:rPr>
-        <w:t>) {</w:t>
+        <w:t xml:space="preserve">    public static main(String args) {</w:t>
       </w:r>
     </w:p>
     <w:p>
@@ -3652,25 +2565,7 @@
           <w:sz w:val="20"/>
           <w:szCs w:val="18"/>
         </w:rPr>
-        <w:t xml:space="preserve">        </w:t>
-      </w:r>
-      <w:proofErr w:type="spellStart"/>
-      <w:r>
-        <w:rPr>
-          <w:rFonts w:ascii="Google Sans Code" w:hAnsi="Google Sans Code" w:cs="Courier New"/>
-          <w:sz w:val="20"/>
-          <w:szCs w:val="18"/>
-        </w:rPr>
-        <w:t>System.out.println</w:t>
-      </w:r>
-      <w:proofErr w:type="spellEnd"/>
-      <w:r>
-        <w:rPr>
-          <w:rFonts w:ascii="Google Sans Code" w:hAnsi="Google Sans Code" w:cs="Courier New"/>
-          <w:sz w:val="20"/>
-          <w:szCs w:val="18"/>
-        </w:rPr>
-        <w:t>(Hello world);</w:t>
+        <w:t xml:space="preserve">        System.out.println(Hello world);</w:t>
       </w:r>
     </w:p>
     <w:p>
@@ -3690,27 +2585,7 @@
           <w:sz w:val="20"/>
           <w:szCs w:val="18"/>
         </w:rPr>
-        <w:t xml:space="preserve">        </w:t>
-      </w:r>
-      <w:proofErr w:type="spellStart"/>
-      <w:proofErr w:type="gramStart"/>
-      <w:r>
-        <w:rPr>
-          <w:rFonts w:ascii="Google Sans Code" w:hAnsi="Google Sans Code" w:cs="Courier New"/>
-          <w:sz w:val="20"/>
-          <w:szCs w:val="18"/>
-        </w:rPr>
-        <w:t>system.out.Pritnln</w:t>
-      </w:r>
-      <w:proofErr w:type="spellEnd"/>
-      <w:proofErr w:type="gramEnd"/>
-      <w:r>
-        <w:rPr>
-          <w:rFonts w:ascii="Google Sans Code" w:hAnsi="Google Sans Code" w:cs="Courier New"/>
-          <w:sz w:val="20"/>
-          <w:szCs w:val="18"/>
-        </w:rPr>
-        <w:t>("Do you like this program"?);</w:t>
+        <w:t xml:space="preserve">        system.out.Pritnln("Do you like this program"?);</w:t>
       </w:r>
     </w:p>
     <w:p>
@@ -3730,25 +2605,7 @@
           <w:sz w:val="20"/>
           <w:szCs w:val="18"/>
         </w:rPr>
-        <w:t xml:space="preserve">        </w:t>
-      </w:r>
-      <w:proofErr w:type="spellStart"/>
-      <w:r>
-        <w:rPr>
-          <w:rFonts w:ascii="Google Sans Code" w:hAnsi="Google Sans Code" w:cs="Courier New"/>
-          <w:sz w:val="20"/>
-          <w:szCs w:val="18"/>
-        </w:rPr>
-        <w:t>System.out.println</w:t>
-      </w:r>
-      <w:proofErr w:type="spellEnd"/>
-      <w:r>
-        <w:rPr>
-          <w:rFonts w:ascii="Google Sans Code" w:hAnsi="Google Sans Code" w:cs="Courier New"/>
-          <w:sz w:val="20"/>
-          <w:szCs w:val="18"/>
-        </w:rPr>
-        <w:t>()</w:t>
+        <w:t xml:space="preserve">        System.out.println()</w:t>
       </w:r>
     </w:p>
     <w:p>
@@ -3780,25 +2637,7 @@
           <w:sz w:val="20"/>
           <w:szCs w:val="18"/>
         </w:rPr>
-        <w:t xml:space="preserve">        </w:t>
-      </w:r>
-      <w:proofErr w:type="spellStart"/>
-      <w:r>
-        <w:rPr>
-          <w:rFonts w:ascii="Google Sans Code" w:hAnsi="Google Sans Code" w:cs="Courier New"/>
-          <w:sz w:val="20"/>
-          <w:szCs w:val="18"/>
-        </w:rPr>
-        <w:t>System.println</w:t>
-      </w:r>
-      <w:proofErr w:type="spellEnd"/>
-      <w:r>
-        <w:rPr>
-          <w:rFonts w:ascii="Google Sans Code" w:hAnsi="Google Sans Code" w:cs="Courier New"/>
-          <w:sz w:val="20"/>
-          <w:szCs w:val="18"/>
-        </w:rPr>
-        <w:t>("I wrote it myself.";</w:t>
+        <w:t xml:space="preserve">        System.println("I wrote it myself.";</w:t>
       </w:r>
     </w:p>
     <w:p>
@@ -3884,15 +2723,7 @@
           <w:b/>
           <w:sz w:val="24"/>
         </w:rPr>
-        <w:t xml:space="preserve">Code </w:t>
-      </w:r>
-      <w:r>
-        <w:rPr>
-          <w:rFonts w:ascii="Gabarito" w:hAnsi="Gabarito" w:cstheme="minorHAnsi"/>
-          <w:b/>
-          <w:sz w:val="24"/>
-        </w:rPr>
-        <w:t>8</w:t>
+        <w:t>Code 8</w:t>
       </w:r>
     </w:p>
     <w:p>
@@ -3914,17 +2745,21 @@
           <w:szCs w:val="18"/>
           <w:lang w:val="en-PH"/>
         </w:rPr>
-        <w:t xml:space="preserve">public class </w:t>
-      </w:r>
-      <w:r>
+        <w:t>public class Addition {</w:t>
+      </w:r>
+    </w:p>
+    <w:p>
+      <w:pPr>
+        <w:spacing w:after="0"/>
+        <w:ind w:left="1134"/>
+        <w:jc w:val="both"/>
         <w:rPr>
           <w:rFonts w:ascii="Google Sans Code" w:hAnsi="Google Sans Code" w:cs="Courier New"/>
           <w:sz w:val="20"/>
           <w:szCs w:val="18"/>
           <w:lang w:val="en-PH"/>
         </w:rPr>
-        <w:t>Addition</w:t>
-      </w:r>
+      </w:pPr>
       <w:r>
         <w:rPr>
           <w:rFonts w:ascii="Google Sans Code" w:hAnsi="Google Sans Code" w:cs="Courier New"/>
@@ -3932,7 +2767,7 @@
           <w:szCs w:val="18"/>
           <w:lang w:val="en-PH"/>
         </w:rPr>
-        <w:t xml:space="preserve"> {</w:t>
+        <w:t xml:space="preserve">    public static void main(String[] args) {</w:t>
       </w:r>
     </w:p>
     <w:p>
@@ -3954,19 +2789,21 @@
           <w:szCs w:val="18"/>
           <w:lang w:val="en-PH"/>
         </w:rPr>
-        <w:t xml:space="preserve">    public static void </w:t>
-      </w:r>
-      <w:proofErr w:type="gramStart"/>
-      <w:r>
+        <w:t xml:space="preserve">        int x;</w:t>
+      </w:r>
+    </w:p>
+    <w:p>
+      <w:pPr>
+        <w:spacing w:after="0"/>
+        <w:ind w:left="1134"/>
+        <w:jc w:val="both"/>
         <w:rPr>
           <w:rFonts w:ascii="Google Sans Code" w:hAnsi="Google Sans Code" w:cs="Courier New"/>
           <w:sz w:val="20"/>
           <w:szCs w:val="18"/>
           <w:lang w:val="en-PH"/>
         </w:rPr>
-        <w:t>main(String[</w:t>
-      </w:r>
-      <w:proofErr w:type="gramEnd"/>
+      </w:pPr>
       <w:r>
         <w:rPr>
           <w:rFonts w:ascii="Google Sans Code" w:hAnsi="Google Sans Code" w:cs="Courier New"/>
@@ -3974,27 +2811,42 @@
           <w:szCs w:val="18"/>
           <w:lang w:val="en-PH"/>
         </w:rPr>
-        <w:t xml:space="preserve">] </w:t>
-      </w:r>
-      <w:proofErr w:type="spellStart"/>
-      <w:r>
+        <w:t xml:space="preserve">        System.out.println("x is" x);</w:t>
+      </w:r>
+    </w:p>
+    <w:p>
+      <w:pPr>
+        <w:spacing w:after="0"/>
+        <w:ind w:left="1134"/>
+        <w:jc w:val="both"/>
         <w:rPr>
           <w:rFonts w:ascii="Google Sans Code" w:hAnsi="Google Sans Code" w:cs="Courier New"/>
           <w:sz w:val="20"/>
           <w:szCs w:val="18"/>
           <w:lang w:val="en-PH"/>
         </w:rPr>
-        <w:t>args</w:t>
-      </w:r>
-      <w:proofErr w:type="spellEnd"/>
-      <w:r>
+      </w:pPr>
+    </w:p>
+    <w:p>
+      <w:pPr>
+        <w:spacing w:after="0"/>
+        <w:ind w:left="1134"/>
+        <w:jc w:val="both"/>
         <w:rPr>
           <w:rFonts w:ascii="Google Sans Code" w:hAnsi="Google Sans Code" w:cs="Courier New"/>
           <w:sz w:val="20"/>
           <w:szCs w:val="18"/>
           <w:lang w:val="en-PH"/>
         </w:rPr>
-        <w:t>) {</w:t>
+      </w:pPr>
+      <w:r>
+        <w:rPr>
+          <w:rFonts w:ascii="Google Sans Code" w:hAnsi="Google Sans Code" w:cs="Courier New"/>
+          <w:sz w:val="20"/>
+          <w:szCs w:val="18"/>
+          <w:lang w:val="en-PH"/>
+        </w:rPr>
+        <w:t xml:space="preserve">        int x = 15.2;   // set x to 15.2</w:t>
       </w:r>
     </w:p>
     <w:p>
@@ -4016,7 +2868,7 @@
           <w:szCs w:val="18"/>
           <w:lang w:val="en-PH"/>
         </w:rPr>
-        <w:t xml:space="preserve">        int x;</w:t>
+        <w:t xml:space="preserve">        System.out.println("x is now + x");</w:t>
       </w:r>
     </w:p>
     <w:p>
@@ -4031,16 +2883,19 @@
           <w:lang w:val="en-PH"/>
         </w:rPr>
       </w:pPr>
-      <w:r>
+    </w:p>
+    <w:p>
+      <w:pPr>
+        <w:spacing w:after="0"/>
+        <w:ind w:left="1134"/>
+        <w:jc w:val="both"/>
         <w:rPr>
           <w:rFonts w:ascii="Google Sans Code" w:hAnsi="Google Sans Code" w:cs="Courier New"/>
           <w:sz w:val="20"/>
           <w:szCs w:val="18"/>
           <w:lang w:val="en-PH"/>
         </w:rPr>
-        <w:t xml:space="preserve">        </w:t>
-      </w:r>
-      <w:proofErr w:type="spellStart"/>
+      </w:pPr>
       <w:r>
         <w:rPr>
           <w:rFonts w:ascii="Google Sans Code" w:hAnsi="Google Sans Code" w:cs="Courier New"/>
@@ -4048,17 +2903,29 @@
           <w:szCs w:val="18"/>
           <w:lang w:val="en-PH"/>
         </w:rPr>
-        <w:t>System.out.println</w:t>
-      </w:r>
-      <w:proofErr w:type="spellEnd"/>
-      <w:r>
+        <w:t xml:space="preserve">        int y;          // set y to 1 more than x</w:t>
+      </w:r>
+    </w:p>
+    <w:p>
+      <w:pPr>
+        <w:spacing w:after="0"/>
+        <w:ind w:left="1134"/>
+        <w:jc w:val="both"/>
         <w:rPr>
           <w:rFonts w:ascii="Google Sans Code" w:hAnsi="Google Sans Code" w:cs="Courier New"/>
           <w:sz w:val="20"/>
           <w:szCs w:val="18"/>
           <w:lang w:val="en-PH"/>
         </w:rPr>
-        <w:t>("x is" x);</w:t>
+      </w:pPr>
+      <w:r>
+        <w:rPr>
+          <w:rFonts w:ascii="Google Sans Code" w:hAnsi="Google Sans Code" w:cs="Courier New"/>
+          <w:sz w:val="20"/>
+          <w:szCs w:val="18"/>
+          <w:lang w:val="en-PH"/>
+        </w:rPr>
+        <w:t xml:space="preserve">        y = int x + 1;</w:t>
       </w:r>
     </w:p>
     <w:p>
@@ -4073,188 +2940,14 @@
           <w:lang w:val="en-PH"/>
         </w:rPr>
       </w:pPr>
-    </w:p>
-    <w:p>
-      <w:pPr>
-        <w:spacing w:after="0"/>
-        <w:ind w:left="1134"/>
-        <w:jc w:val="both"/>
+      <w:r>
         <w:rPr>
           <w:rFonts w:ascii="Google Sans Code" w:hAnsi="Google Sans Code" w:cs="Courier New"/>
           <w:sz w:val="20"/>
           <w:szCs w:val="18"/>
           <w:lang w:val="en-PH"/>
         </w:rPr>
-      </w:pPr>
-      <w:r>
-        <w:rPr>
-          <w:rFonts w:ascii="Google Sans Code" w:hAnsi="Google Sans Code" w:cs="Courier New"/>
-          <w:sz w:val="20"/>
-          <w:szCs w:val="18"/>
-          <w:lang w:val="en-PH"/>
-        </w:rPr>
-        <w:t xml:space="preserve">        int x = 15.2;   // set x to 15.2</w:t>
-      </w:r>
-    </w:p>
-    <w:p>
-      <w:pPr>
-        <w:spacing w:after="0"/>
-        <w:ind w:left="1134"/>
-        <w:jc w:val="both"/>
-        <w:rPr>
-          <w:rFonts w:ascii="Google Sans Code" w:hAnsi="Google Sans Code" w:cs="Courier New"/>
-          <w:sz w:val="20"/>
-          <w:szCs w:val="18"/>
-          <w:lang w:val="en-PH"/>
-        </w:rPr>
-      </w:pPr>
-      <w:r>
-        <w:rPr>
-          <w:rFonts w:ascii="Google Sans Code" w:hAnsi="Google Sans Code" w:cs="Courier New"/>
-          <w:sz w:val="20"/>
-          <w:szCs w:val="18"/>
-          <w:lang w:val="en-PH"/>
-        </w:rPr>
-        <w:t xml:space="preserve">        </w:t>
-      </w:r>
-      <w:proofErr w:type="spellStart"/>
-      <w:r>
-        <w:rPr>
-          <w:rFonts w:ascii="Google Sans Code" w:hAnsi="Google Sans Code" w:cs="Courier New"/>
-          <w:sz w:val="20"/>
-          <w:szCs w:val="18"/>
-          <w:lang w:val="en-PH"/>
-        </w:rPr>
-        <w:t>System.out.println</w:t>
-      </w:r>
-      <w:proofErr w:type="spellEnd"/>
-      <w:r>
-        <w:rPr>
-          <w:rFonts w:ascii="Google Sans Code" w:hAnsi="Google Sans Code" w:cs="Courier New"/>
-          <w:sz w:val="20"/>
-          <w:szCs w:val="18"/>
-          <w:lang w:val="en-PH"/>
-        </w:rPr>
-        <w:t>("x is now + x");</w:t>
-      </w:r>
-    </w:p>
-    <w:p>
-      <w:pPr>
-        <w:spacing w:after="0"/>
-        <w:ind w:left="1134"/>
-        <w:jc w:val="both"/>
-        <w:rPr>
-          <w:rFonts w:ascii="Google Sans Code" w:hAnsi="Google Sans Code" w:cs="Courier New"/>
-          <w:sz w:val="20"/>
-          <w:szCs w:val="18"/>
-          <w:lang w:val="en-PH"/>
-        </w:rPr>
-      </w:pPr>
-    </w:p>
-    <w:p>
-      <w:pPr>
-        <w:spacing w:after="0"/>
-        <w:ind w:left="1134"/>
-        <w:jc w:val="both"/>
-        <w:rPr>
-          <w:rFonts w:ascii="Google Sans Code" w:hAnsi="Google Sans Code" w:cs="Courier New"/>
-          <w:sz w:val="20"/>
-          <w:szCs w:val="18"/>
-          <w:lang w:val="en-PH"/>
-        </w:rPr>
-      </w:pPr>
-      <w:r>
-        <w:rPr>
-          <w:rFonts w:ascii="Google Sans Code" w:hAnsi="Google Sans Code" w:cs="Courier New"/>
-          <w:sz w:val="20"/>
-          <w:szCs w:val="18"/>
-          <w:lang w:val="en-PH"/>
-        </w:rPr>
-        <w:t xml:space="preserve">        int </w:t>
-      </w:r>
-      <w:proofErr w:type="gramStart"/>
-      <w:r>
-        <w:rPr>
-          <w:rFonts w:ascii="Google Sans Code" w:hAnsi="Google Sans Code" w:cs="Courier New"/>
-          <w:sz w:val="20"/>
-          <w:szCs w:val="18"/>
-          <w:lang w:val="en-PH"/>
-        </w:rPr>
-        <w:t xml:space="preserve">y;   </w:t>
-      </w:r>
-      <w:proofErr w:type="gramEnd"/>
-      <w:r>
-        <w:rPr>
-          <w:rFonts w:ascii="Google Sans Code" w:hAnsi="Google Sans Code" w:cs="Courier New"/>
-          <w:sz w:val="20"/>
-          <w:szCs w:val="18"/>
-          <w:lang w:val="en-PH"/>
-        </w:rPr>
-        <w:t xml:space="preserve">       // set y to 1 more than x</w:t>
-      </w:r>
-    </w:p>
-    <w:p>
-      <w:pPr>
-        <w:spacing w:after="0"/>
-        <w:ind w:left="1134"/>
-        <w:jc w:val="both"/>
-        <w:rPr>
-          <w:rFonts w:ascii="Google Sans Code" w:hAnsi="Google Sans Code" w:cs="Courier New"/>
-          <w:sz w:val="20"/>
-          <w:szCs w:val="18"/>
-          <w:lang w:val="en-PH"/>
-        </w:rPr>
-      </w:pPr>
-      <w:r>
-        <w:rPr>
-          <w:rFonts w:ascii="Google Sans Code" w:hAnsi="Google Sans Code" w:cs="Courier New"/>
-          <w:sz w:val="20"/>
-          <w:szCs w:val="18"/>
-          <w:lang w:val="en-PH"/>
-        </w:rPr>
-        <w:t xml:space="preserve">        y = int x + 1;</w:t>
-      </w:r>
-    </w:p>
-    <w:p>
-      <w:pPr>
-        <w:spacing w:after="0"/>
-        <w:ind w:left="1134"/>
-        <w:jc w:val="both"/>
-        <w:rPr>
-          <w:rFonts w:ascii="Google Sans Code" w:hAnsi="Google Sans Code" w:cs="Courier New"/>
-          <w:sz w:val="20"/>
-          <w:szCs w:val="18"/>
-          <w:lang w:val="en-PH"/>
-        </w:rPr>
-      </w:pPr>
-      <w:r>
-        <w:rPr>
-          <w:rFonts w:ascii="Google Sans Code" w:hAnsi="Google Sans Code" w:cs="Courier New"/>
-          <w:sz w:val="20"/>
-          <w:szCs w:val="18"/>
-          <w:lang w:val="en-PH"/>
-        </w:rPr>
-        <w:t xml:space="preserve">        </w:t>
-      </w:r>
-      <w:proofErr w:type="spellStart"/>
-      <w:r>
-        <w:rPr>
-          <w:rFonts w:ascii="Google Sans Code" w:hAnsi="Google Sans Code" w:cs="Courier New"/>
-          <w:sz w:val="20"/>
-          <w:szCs w:val="18"/>
-          <w:lang w:val="en-PH"/>
-        </w:rPr>
-        <w:t>System.out.println</w:t>
-      </w:r>
-      <w:proofErr w:type="spellEnd"/>
-      <w:r>
-        <w:rPr>
-          <w:rFonts w:ascii="Google Sans Code" w:hAnsi="Google Sans Code" w:cs="Courier New"/>
-          <w:sz w:val="20"/>
-          <w:szCs w:val="18"/>
-          <w:lang w:val="en-PH"/>
-        </w:rPr>
-        <w:t>("x and y are " + x + and + y);</w:t>
+        <w:t xml:space="preserve">        System.out.println("x and y are " + x + and + y);</w:t>
       </w:r>
     </w:p>
     <w:p>
@@ -4335,7 +3028,6 @@
         </w:rPr>
         <w:t xml:space="preserve">Write a Java class </w:t>
       </w:r>
-      <w:proofErr w:type="spellStart"/>
       <w:r>
         <w:rPr>
           <w:rFonts w:ascii="Google Sans Code" w:hAnsi="Google Sans Code" w:cs="Courier New"/>
@@ -4345,7 +3037,6 @@
         </w:rPr>
         <w:t>AssignMe</w:t>
       </w:r>
-      <w:proofErr w:type="spellEnd"/>
       <w:r>
         <w:rPr>
           <w:rFonts w:ascii="Gabarito" w:hAnsi="Gabarito" w:cs="Open Sans"/>
@@ -4379,7 +3070,6 @@
         </w:rPr>
         <w:t xml:space="preserve"> </w:t>
       </w:r>
-      <w:proofErr w:type="gramStart"/>
       <w:r>
         <w:rPr>
           <w:rFonts w:ascii="Google Sans Code" w:hAnsi="Google Sans Code" w:cs="Courier New"/>
@@ -4387,17 +3077,7 @@
           <w:bCs/>
           <w:color w:val="EE0000"/>
         </w:rPr>
-        <w:t>main(</w:t>
-      </w:r>
-      <w:proofErr w:type="gramEnd"/>
-      <w:r>
-        <w:rPr>
-          <w:rFonts w:ascii="Google Sans Code" w:hAnsi="Google Sans Code" w:cs="Courier New"/>
-          <w:b/>
-          <w:bCs/>
-          <w:color w:val="EE0000"/>
-        </w:rPr>
-        <w:t>)</w:t>
+        <w:t>main()</w:t>
       </w:r>
       <w:r>
         <w:rPr>
@@ -4619,25 +3299,7 @@
           <w:sz w:val="24"/>
           <w:szCs w:val="24"/>
         </w:rPr>
-        <w:t xml:space="preserve">(without explicitly </w:t>
-      </w:r>
-      <w:proofErr w:type="gramStart"/>
-      <w:r>
-        <w:rPr>
-          <w:rFonts w:ascii="Gabarito" w:hAnsi="Gabarito" w:cs="Open Sans"/>
-          <w:sz w:val="24"/>
-          <w:szCs w:val="24"/>
-        </w:rPr>
-        <w:t>assign</w:t>
-      </w:r>
-      <w:proofErr w:type="gramEnd"/>
-      <w:r>
-        <w:rPr>
-          <w:rFonts w:ascii="Gabarito" w:hAnsi="Gabarito" w:cs="Open Sans"/>
-          <w:sz w:val="24"/>
-          <w:szCs w:val="24"/>
-        </w:rPr>
-        <w:t xml:space="preserve"> 3 to </w:t>
+        <w:t xml:space="preserve">(without explicitly assign 3 to </w:t>
       </w:r>
       <w:r>
         <w:rPr>
@@ -4712,7 +3374,6 @@
         </w:rPr>
         <w:t xml:space="preserve">Drop the class inside </w:t>
       </w:r>
-      <w:proofErr w:type="spellStart"/>
       <w:r>
         <w:rPr>
           <w:rFonts w:ascii="Google Sans Code" w:hAnsi="Google Sans Code" w:cs="Courier New"/>
@@ -4749,7 +3410,6 @@
         </w:rPr>
         <w:t>b</w:t>
       </w:r>
-      <w:proofErr w:type="spellEnd"/>
       <w:r>
         <w:rPr>
           <w:rFonts w:ascii="Gabarito" w:hAnsi="Gabarito" w:cs="Open Sans"/>
@@ -4792,7 +3452,6 @@
         </w:rPr>
         <w:t xml:space="preserve">Write a Java class </w:t>
       </w:r>
-      <w:proofErr w:type="spellStart"/>
       <w:r>
         <w:rPr>
           <w:rFonts w:ascii="Google Sans Code" w:hAnsi="Google Sans Code" w:cs="Courier New"/>
@@ -4802,7 +3461,6 @@
         </w:rPr>
         <w:t>DeclareMe</w:t>
       </w:r>
-      <w:proofErr w:type="spellEnd"/>
       <w:r>
         <w:rPr>
           <w:rFonts w:ascii="Gabarito" w:hAnsi="Gabarito" w:cs="Courier New"/>
@@ -4837,7 +3495,6 @@
         </w:rPr>
         <w:t xml:space="preserve"> </w:t>
       </w:r>
-      <w:proofErr w:type="gramStart"/>
       <w:r>
         <w:rPr>
           <w:rFonts w:ascii="Google Sans Code" w:hAnsi="Google Sans Code" w:cs="Courier New"/>
@@ -4845,17 +3502,7 @@
           <w:bCs/>
           <w:color w:val="EE0000"/>
         </w:rPr>
-        <w:t>main(</w:t>
-      </w:r>
-      <w:proofErr w:type="gramEnd"/>
-      <w:r>
-        <w:rPr>
-          <w:rFonts w:ascii="Google Sans Code" w:hAnsi="Google Sans Code" w:cs="Courier New"/>
-          <w:b/>
-          <w:bCs/>
-          <w:color w:val="EE0000"/>
-        </w:rPr>
-        <w:t>)</w:t>
+        <w:t>main()</w:t>
       </w:r>
       <w:r>
         <w:rPr>
@@ -5088,7 +3735,6 @@
         </w:rPr>
         <w:t xml:space="preserve">                        Drop the class inside </w:t>
       </w:r>
-      <w:proofErr w:type="spellStart"/>
       <w:r>
         <w:rPr>
           <w:rFonts w:ascii="Google Sans Code" w:hAnsi="Google Sans Code" w:cs="Courier New"/>
@@ -5125,7 +3771,6 @@
         </w:rPr>
         <w:t>c</w:t>
       </w:r>
-      <w:proofErr w:type="spellEnd"/>
       <w:r>
         <w:rPr>
           <w:rFonts w:ascii="Gabarito" w:hAnsi="Gabarito" w:cs="Open Sans"/>
@@ -5248,7 +3893,6 @@
         </w:rPr>
         <w:t xml:space="preserve">Before implementing your solution in Java syntax, write the pseudocode of a class </w:t>
       </w:r>
-      <w:proofErr w:type="spellStart"/>
       <w:r>
         <w:rPr>
           <w:rFonts w:ascii="Google Sans Code" w:hAnsi="Google Sans Code" w:cs="Courier New"/>
@@ -5258,7 +3902,6 @@
         </w:rPr>
         <w:t>SalesTax</w:t>
       </w:r>
-      <w:proofErr w:type="spellEnd"/>
       <w:r>
         <w:rPr>
           <w:rFonts w:ascii="Gabarito" w:hAnsi="Gabarito" w:cs="Open Sans"/>
@@ -5278,7 +3921,6 @@
         </w:rPr>
         <w:t xml:space="preserve">that has a method </w:t>
       </w:r>
-      <w:proofErr w:type="spellStart"/>
       <w:r>
         <w:rPr>
           <w:rFonts w:ascii="Google Sans Code" w:hAnsi="Google Sans Code" w:cs="Courier New"/>
@@ -5286,37 +3928,7 @@
           <w:bCs/>
           <w:color w:val="EE0000"/>
         </w:rPr>
-        <w:t>computeCost</w:t>
-      </w:r>
-      <w:proofErr w:type="spellEnd"/>
-      <w:r>
-        <w:rPr>
-          <w:rFonts w:ascii="Google Sans Code" w:hAnsi="Google Sans Code" w:cs="Courier New"/>
-          <w:b/>
-          <w:bCs/>
-          <w:color w:val="EE0000"/>
-        </w:rPr>
-        <w:t>(</w:t>
-      </w:r>
-      <w:proofErr w:type="spellStart"/>
-      <w:r>
-        <w:rPr>
-          <w:rFonts w:ascii="Google Sans Code" w:hAnsi="Google Sans Code" w:cs="Courier New"/>
-          <w:b/>
-          <w:bCs/>
-          <w:color w:val="EE0000"/>
-        </w:rPr>
-        <w:t>itemCost</w:t>
-      </w:r>
-      <w:proofErr w:type="spellEnd"/>
-      <w:r>
-        <w:rPr>
-          <w:rFonts w:ascii="Google Sans Code" w:hAnsi="Google Sans Code" w:cs="Courier New"/>
-          <w:b/>
-          <w:bCs/>
-          <w:color w:val="EE0000"/>
-        </w:rPr>
-        <w:t>)</w:t>
+        <w:t>computeCost(itemCost)</w:t>
       </w:r>
       <w:r>
         <w:rPr>
@@ -5495,25 +4107,7 @@
           <w:sz w:val="24"/>
           <w:szCs w:val="24"/>
         </w:rPr>
-        <w:t xml:space="preserve">The total amount due </w:t>
-      </w:r>
-      <w:proofErr w:type="gramStart"/>
-      <w:r>
-        <w:rPr>
-          <w:rFonts w:ascii="Gabarito" w:hAnsi="Gabarito" w:cs="Open Sans"/>
-          <w:sz w:val="24"/>
-          <w:szCs w:val="24"/>
-        </w:rPr>
-        <w:t>from</w:t>
-      </w:r>
-      <w:proofErr w:type="gramEnd"/>
-      <w:r>
-        <w:rPr>
-          <w:rFonts w:ascii="Gabarito" w:hAnsi="Gabarito" w:cs="Open Sans"/>
-          <w:sz w:val="24"/>
-          <w:szCs w:val="24"/>
-        </w:rPr>
-        <w:t xml:space="preserve"> the user (cost of item + amount of state sales tax + amount of county sales tax)</w:t>
+        <w:t>The total amount due from the user (cost of item + amount of state sales tax + amount of county sales tax)</w:t>
       </w:r>
     </w:p>
     <w:p>
@@ -5544,7 +4138,6 @@
         </w:rPr>
         <w:t xml:space="preserve">      Create a test class </w:t>
       </w:r>
-      <w:proofErr w:type="spellStart"/>
       <w:r>
         <w:rPr>
           <w:rFonts w:ascii="Google Sans Code" w:hAnsi="Google Sans Code" w:cs="Courier New"/>
@@ -5554,7 +4147,6 @@
         </w:rPr>
         <w:t>TestSalesTax</w:t>
       </w:r>
-      <w:proofErr w:type="spellEnd"/>
       <w:r>
         <w:rPr>
           <w:rFonts w:ascii="Gabarito" w:hAnsi="Gabarito" w:cs="Open Sans"/>
@@ -5563,7 +4155,6 @@
         </w:rPr>
         <w:t xml:space="preserve"> to run </w:t>
       </w:r>
-      <w:proofErr w:type="spellStart"/>
       <w:r>
         <w:rPr>
           <w:rFonts w:ascii="Google Sans Code" w:hAnsi="Google Sans Code" w:cs="Courier New"/>
@@ -5571,19 +4162,25 @@
           <w:bCs/>
           <w:color w:val="EE0000"/>
         </w:rPr>
-        <w:t>computeCost</w:t>
-      </w:r>
-      <w:proofErr w:type="spellEnd"/>
-      <w:r>
-        <w:rPr>
-          <w:rFonts w:ascii="Google Sans Code" w:hAnsi="Google Sans Code" w:cs="Courier New"/>
+        <w:t>computeCost(itemCost)</w:t>
+      </w:r>
+      <w:r>
+        <w:rPr>
+          <w:rFonts w:ascii="Gabarito" w:hAnsi="Gabarito" w:cs="Courier New"/>
           <w:b/>
           <w:bCs/>
           <w:color w:val="EE0000"/>
         </w:rPr>
-        <w:t>(</w:t>
-      </w:r>
-      <w:proofErr w:type="spellStart"/>
+        <w:t xml:space="preserve"> </w:t>
+      </w:r>
+      <w:r>
+        <w:rPr>
+          <w:rFonts w:ascii="Gabarito" w:hAnsi="Gabarito" w:cs="Open Sans"/>
+          <w:sz w:val="24"/>
+          <w:szCs w:val="24"/>
+        </w:rPr>
+        <w:t xml:space="preserve">with varying </w:t>
+      </w:r>
       <w:r>
         <w:rPr>
           <w:rFonts w:ascii="Google Sans Code" w:hAnsi="Google Sans Code" w:cs="Courier New"/>
@@ -5593,44 +4190,6 @@
         </w:rPr>
         <w:t>itemCost</w:t>
       </w:r>
-      <w:proofErr w:type="spellEnd"/>
-      <w:r>
-        <w:rPr>
-          <w:rFonts w:ascii="Google Sans Code" w:hAnsi="Google Sans Code" w:cs="Courier New"/>
-          <w:b/>
-          <w:bCs/>
-          <w:color w:val="EE0000"/>
-        </w:rPr>
-        <w:t>)</w:t>
-      </w:r>
-      <w:r>
-        <w:rPr>
-          <w:rFonts w:ascii="Gabarito" w:hAnsi="Gabarito" w:cs="Courier New"/>
-          <w:b/>
-          <w:bCs/>
-          <w:color w:val="EE0000"/>
-        </w:rPr>
-        <w:t xml:space="preserve"> </w:t>
-      </w:r>
-      <w:r>
-        <w:rPr>
-          <w:rFonts w:ascii="Gabarito" w:hAnsi="Gabarito" w:cs="Open Sans"/>
-          <w:sz w:val="24"/>
-          <w:szCs w:val="24"/>
-        </w:rPr>
-        <w:t xml:space="preserve">with varying </w:t>
-      </w:r>
-      <w:proofErr w:type="spellStart"/>
-      <w:r>
-        <w:rPr>
-          <w:rFonts w:ascii="Google Sans Code" w:hAnsi="Google Sans Code" w:cs="Courier New"/>
-          <w:b/>
-          <w:bCs/>
-          <w:color w:val="EE0000"/>
-        </w:rPr>
-        <w:t>itemCost</w:t>
-      </w:r>
-      <w:proofErr w:type="spellEnd"/>
       <w:r>
         <w:rPr>
           <w:rFonts w:ascii="Gabarito" w:hAnsi="Gabarito" w:cs="Open Sans"/>
@@ -5691,25 +4250,7 @@
           <w:sz w:val="24"/>
           <w:szCs w:val="24"/>
         </w:rPr>
-        <w:t xml:space="preserve">Applying the flowcharting </w:t>
-      </w:r>
-      <w:proofErr w:type="gramStart"/>
-      <w:r>
-        <w:rPr>
-          <w:rFonts w:ascii="Gabarito" w:hAnsi="Gabarito" w:cs="Open Sans"/>
-          <w:sz w:val="24"/>
-          <w:szCs w:val="24"/>
-        </w:rPr>
-        <w:t>discusses</w:t>
-      </w:r>
-      <w:proofErr w:type="gramEnd"/>
-      <w:r>
-        <w:rPr>
-          <w:rFonts w:ascii="Gabarito" w:hAnsi="Gabarito" w:cs="Open Sans"/>
-          <w:sz w:val="24"/>
-          <w:szCs w:val="24"/>
-        </w:rPr>
-        <w:t xml:space="preserve"> in </w:t>
+        <w:t xml:space="preserve">Applying the flowcharting discusses in </w:t>
       </w:r>
       <w:r>
         <w:rPr>
@@ -5747,7 +4288,6 @@
         </w:rPr>
         <w:t xml:space="preserve">. Save the PNG format of your flowchart in </w:t>
       </w:r>
-      <w:proofErr w:type="spellStart"/>
       <w:r>
         <w:rPr>
           <w:rFonts w:ascii="Gabarito" w:hAnsi="Gabarito" w:cs="Courier New"/>
@@ -5757,19 +4297,7 @@
           <w:sz w:val="24"/>
           <w:szCs w:val="24"/>
         </w:rPr>
-        <w:t>src</w:t>
-      </w:r>
-      <w:proofErr w:type="spellEnd"/>
-      <w:r>
-        <w:rPr>
-          <w:rFonts w:ascii="Gabarito" w:hAnsi="Gabarito" w:cs="Courier New"/>
-          <w:b/>
-          <w:bCs/>
-          <w:color w:val="FF0000"/>
-          <w:sz w:val="24"/>
-          <w:szCs w:val="24"/>
-        </w:rPr>
-        <w:t>/pseudocode</w:t>
+        <w:t>src/pseudocode</w:t>
       </w:r>
       <w:r>
         <w:rPr>
@@ -5814,7 +4342,6 @@
         </w:rPr>
         <w:t xml:space="preserve">Implement your flowchart using Java syntax discussed today from declaration of variables, choosing the right data types, and writing the proper codes. Place your solution inside </w:t>
       </w:r>
-      <w:proofErr w:type="spellStart"/>
       <w:r>
         <w:rPr>
           <w:rFonts w:ascii="Google Sans Code" w:hAnsi="Google Sans Code" w:cs="Courier New"/>
@@ -5851,7 +4378,6 @@
         </w:rPr>
         <w:t>d</w:t>
       </w:r>
-      <w:proofErr w:type="spellEnd"/>
       <w:r>
         <w:rPr>
           <w:rFonts w:ascii="Gabarito" w:hAnsi="Gabarito" w:cs="Open Sans"/>
@@ -5931,7 +4457,6 @@
         </w:rPr>
         <w:t xml:space="preserve">. Reformat it using the rules given in this chapter and add a comment header at the top of the program regarding what the class is supposed to do. Place the class inside </w:t>
       </w:r>
-      <w:proofErr w:type="spellStart"/>
       <w:r>
         <w:rPr>
           <w:rFonts w:ascii="Google Sans Code" w:hAnsi="Google Sans Code" w:cs="Courier New"/>
@@ -5968,7 +4493,6 @@
         </w:rPr>
         <w:t>.e</w:t>
       </w:r>
-      <w:proofErr w:type="spellEnd"/>
       <w:r>
         <w:rPr>
           <w:rFonts w:ascii="Gabarito" w:hAnsi="Gabarito" w:cs="Open Sans"/>
@@ -6065,66 +4589,8 @@
         <w:rPr>
           <w:rFonts w:ascii="Google Sans Code" w:hAnsi="Google Sans Code" w:cs="Courier New"/>
         </w:rPr>
-        <w:t xml:space="preserve">public class </w:t>
-      </w:r>
-      <w:proofErr w:type="spellStart"/>
-      <w:r>
-        <w:rPr>
-          <w:rFonts w:ascii="Google Sans Code" w:hAnsi="Google Sans Code" w:cs="Courier New"/>
-        </w:rPr>
-        <w:t>SumProd</w:t>
-      </w:r>
-      <w:proofErr w:type="spellEnd"/>
-      <w:r>
-        <w:rPr>
-          <w:rFonts w:ascii="Google Sans Code" w:hAnsi="Google Sans Code" w:cs="Courier New"/>
-        </w:rPr>
-        <w:t xml:space="preserve"> </w:t>
-      </w:r>
-      <w:proofErr w:type="gramStart"/>
-      <w:r>
-        <w:rPr>
-          <w:rFonts w:ascii="Google Sans Code" w:hAnsi="Google Sans Code" w:cs="Courier New"/>
-        </w:rPr>
-        <w:t>{ public</w:t>
-      </w:r>
-      <w:proofErr w:type="gramEnd"/>
-      <w:r>
-        <w:rPr>
-          <w:rFonts w:ascii="Google Sans Code" w:hAnsi="Google Sans Code" w:cs="Courier New"/>
-        </w:rPr>
-        <w:t xml:space="preserve"> static void </w:t>
-      </w:r>
-      <w:proofErr w:type="gramStart"/>
-      <w:r>
-        <w:rPr>
-          <w:rFonts w:ascii="Google Sans Code" w:hAnsi="Google Sans Code" w:cs="Courier New"/>
-        </w:rPr>
-        <w:t>main(String[</w:t>
-      </w:r>
-      <w:proofErr w:type="gramEnd"/>
-      <w:r>
-        <w:rPr>
-          <w:rFonts w:ascii="Google Sans Code" w:hAnsi="Google Sans Code" w:cs="Courier New"/>
-        </w:rPr>
-        <w:t xml:space="preserve">] </w:t>
-      </w:r>
-      <w:proofErr w:type="spellStart"/>
-      <w:proofErr w:type="gramStart"/>
-      <w:r>
-        <w:rPr>
-          <w:rFonts w:ascii="Google Sans Code" w:hAnsi="Google Sans Code" w:cs="Courier New"/>
-        </w:rPr>
-        <w:t>args</w:t>
-      </w:r>
-      <w:proofErr w:type="spellEnd"/>
-      <w:r>
-        <w:rPr>
-          <w:rFonts w:ascii="Google Sans Code" w:hAnsi="Google Sans Code" w:cs="Courier New"/>
-        </w:rPr>
-        <w:t>){</w:t>
-      </w:r>
-      <w:proofErr w:type="gramEnd"/>
+        <w:t>public class SumProd { public static void main(String[] args){</w:t>
+      </w:r>
     </w:p>
     <w:p>
       <w:pPr>
@@ -6139,21 +4605,7 @@
         <w:rPr>
           <w:rFonts w:ascii="Google Sans Code" w:hAnsi="Google Sans Code" w:cs="Courier New"/>
         </w:rPr>
-        <w:t xml:space="preserve">final int INT2=8; final int INT1=20; </w:t>
-      </w:r>
-      <w:proofErr w:type="spellStart"/>
-      <w:r>
-        <w:rPr>
-          <w:rFonts w:ascii="Google Sans Code" w:hAnsi="Google Sans Code" w:cs="Courier New"/>
-        </w:rPr>
-        <w:t>System.out.println</w:t>
-      </w:r>
-      <w:proofErr w:type="spellEnd"/>
-      <w:r>
-        <w:rPr>
-          <w:rFonts w:ascii="Google Sans Code" w:hAnsi="Google Sans Code" w:cs="Courier New"/>
-        </w:rPr>
-        <w:t>(</w:t>
+        <w:t>final int INT2=8; final int INT1=20; System.out.println(</w:t>
       </w:r>
     </w:p>
     <w:p>
@@ -6169,35 +4621,7 @@
         <w:rPr>
           <w:rFonts w:ascii="Google Sans Code" w:hAnsi="Google Sans Code" w:cs="Courier New"/>
         </w:rPr>
-        <w:t xml:space="preserve">“The sum of </w:t>
-      </w:r>
-      <w:proofErr w:type="gramStart"/>
-      <w:r>
-        <w:rPr>
-          <w:rFonts w:ascii="Google Sans Code" w:hAnsi="Google Sans Code" w:cs="Courier New"/>
-        </w:rPr>
-        <w:t>“ +</w:t>
-      </w:r>
-      <w:proofErr w:type="gramEnd"/>
-      <w:r>
-        <w:rPr>
-          <w:rFonts w:ascii="Google Sans Code" w:hAnsi="Google Sans Code" w:cs="Courier New"/>
-        </w:rPr>
-        <w:t xml:space="preserve"> INT1 + </w:t>
-      </w:r>
-      <w:proofErr w:type="gramStart"/>
-      <w:r>
-        <w:rPr>
-          <w:rFonts w:ascii="Google Sans Code" w:hAnsi="Google Sans Code" w:cs="Courier New"/>
-        </w:rPr>
-        <w:t>“ and</w:t>
-      </w:r>
-      <w:proofErr w:type="gramEnd"/>
-      <w:r>
-        <w:rPr>
-          <w:rFonts w:ascii="Google Sans Code" w:hAnsi="Google Sans Code" w:cs="Courier New"/>
-        </w:rPr>
-        <w:t xml:space="preserve"> ”</w:t>
+        <w:t>“The sum of “ + INT1 + “ and ”</w:t>
       </w:r>
     </w:p>
     <w:p>
@@ -6213,49 +4637,7 @@
         <w:rPr>
           <w:rFonts w:ascii="Google Sans Code" w:hAnsi="Google Sans Code" w:cs="Courier New"/>
         </w:rPr>
-        <w:t xml:space="preserve">+ INT2 + </w:t>
-      </w:r>
-      <w:proofErr w:type="gramStart"/>
-      <w:r>
-        <w:rPr>
-          <w:rFonts w:ascii="Google Sans Code" w:hAnsi="Google Sans Code" w:cs="Courier New"/>
-        </w:rPr>
-        <w:t>“ is</w:t>
-      </w:r>
-      <w:proofErr w:type="gramEnd"/>
-      <w:r>
-        <w:rPr>
-          <w:rFonts w:ascii="Google Sans Code" w:hAnsi="Google Sans Code" w:cs="Courier New"/>
-        </w:rPr>
-        <w:t xml:space="preserve"> </w:t>
-      </w:r>
-      <w:proofErr w:type="gramStart"/>
-      <w:r>
-        <w:rPr>
-          <w:rFonts w:ascii="Google Sans Code" w:hAnsi="Google Sans Code" w:cs="Courier New"/>
-        </w:rPr>
-        <w:t>“ +</w:t>
-      </w:r>
-      <w:proofErr w:type="gramEnd"/>
-      <w:r>
-        <w:rPr>
-          <w:rFonts w:ascii="Google Sans Code" w:hAnsi="Google Sans Code" w:cs="Courier New"/>
-        </w:rPr>
-        <w:t xml:space="preserve"> (INT1+INT2)); </w:t>
-      </w:r>
-      <w:proofErr w:type="spellStart"/>
-      <w:r>
-        <w:rPr>
-          <w:rFonts w:ascii="Google Sans Code" w:hAnsi="Google Sans Code" w:cs="Courier New"/>
-        </w:rPr>
-        <w:t>System.out.println</w:t>
-      </w:r>
-      <w:proofErr w:type="spellEnd"/>
-      <w:r>
-        <w:rPr>
-          <w:rFonts w:ascii="Google Sans Code" w:hAnsi="Google Sans Code" w:cs="Courier New"/>
-        </w:rPr>
-        <w:t xml:space="preserve"> (</w:t>
+        <w:t>+ INT2 + “ is “ + (INT1+INT2)); System.out.println (</w:t>
       </w:r>
     </w:p>
     <w:p>
@@ -6271,35 +4653,7 @@
         <w:rPr>
           <w:rFonts w:ascii="Google Sans Code" w:hAnsi="Google Sans Code" w:cs="Courier New"/>
         </w:rPr>
-        <w:t xml:space="preserve">“Their product is </w:t>
-      </w:r>
-      <w:proofErr w:type="gramStart"/>
-      <w:r>
-        <w:rPr>
-          <w:rFonts w:ascii="Google Sans Code" w:hAnsi="Google Sans Code" w:cs="Courier New"/>
-        </w:rPr>
-        <w:t>“ +</w:t>
-      </w:r>
-      <w:proofErr w:type="gramEnd"/>
-      <w:r>
-        <w:rPr>
-          <w:rFonts w:ascii="Google Sans Code" w:hAnsi="Google Sans Code" w:cs="Courier New"/>
-        </w:rPr>
-        <w:t xml:space="preserve"> (INT1*INT2))</w:t>
-      </w:r>
-      <w:proofErr w:type="gramStart"/>
-      <w:r>
-        <w:rPr>
-          <w:rFonts w:ascii="Google Sans Code" w:hAnsi="Google Sans Code" w:cs="Courier New"/>
-        </w:rPr>
-        <w:t>; }</w:t>
-      </w:r>
-      <w:proofErr w:type="gramEnd"/>
-      <w:r>
-        <w:rPr>
-          <w:rFonts w:ascii="Google Sans Code" w:hAnsi="Google Sans Code" w:cs="Courier New"/>
-        </w:rPr>
-        <w:t>}</w:t>
+        <w:t>“Their product is “ + (INT1*INT2)); }}</w:t>
       </w:r>
     </w:p>
     <w:p>

</xml_diff>